<commit_message>
Polish JAMT v2.31 appendix formatting and remaining review fixes.
Rebuild the Word supplement with ISO/T11/mutation tables, clarify mumps severity wording, report SO-excluded floors, and mark T11 as descriptive with pre-specified Wilson bands.

Co-authored-by: Cursor <cursoragent@cursor.com>
</commit_message>
<xml_diff>
--- a/docs/pilot-study/manuscripts/Supplement1_verification.docx
+++ b/docs/pilot-study/manuscripts/Supplement1_verification.docx
@@ -7,52 +7,22 @@
         <w:pStyle w:val="Heading1"/>
       </w:pPr>
       <w:r>
-        <w:t>電子付録1．聴力像自動生成・仕様適合検証結果（JAMT_v2.31対応）</w:t>
+        <w:t>電子付録1</w:t>
       </w:r>
     </w:p>
     <w:p>
       <w:r>
-        <w:t>- 対応原稿: manuscript_IgakuKensa_AudioScopeEDU_technical_validity_JAMT_v2.31.docx</w:t>
+        <w:t>聴力像自動生成の出力規則適合検証結果</w:t>
       </w:r>
     </w:p>
     <w:p>
       <w:r>
-        <w:t>- T6a/T6bおよびT6c/T6dは同一200件での付与の有無と形の確認であり、付与例を別に200件集めた試験ではない。</w:t>
+        <w:t>対応原稿：年齢・性別・聴力像パターンに応じた教育用オージオグラム自動生成システムの開発と出力規則の検証（技術論文）</w:t>
       </w:r>
     </w:p>
     <w:p>
       <w:r>
-        <w:t>- 本付録の数値は現行生成器・検証スクリプトの再実行結果である（旧25 dB床・C5無床などの数値は用いない）。</w:t>
-      </w:r>
-    </w:p>
-    <w:p>
-      <w:r>
-        <w:t>- 実行日時: 2026-09-04T13:53:04.513Z</w:t>
-      </w:r>
-    </w:p>
-    <w:p>
-      <w:r>
-        <w:t>- 実行環境: Node v22.20.0 / darwin</w:t>
-      </w:r>
-    </w:p>
-    <w:p>
-      <w:r>
-        <w:t>- 要因組合せ: 10プロファイル（正常1+疾患9）× 6年齢群 × 2性別 × 4程度 × 20 seed = **9600** 件の合成閾値セット</w:t>
-      </w:r>
-    </w:p>
-    <w:p>
-      <w:r>
-        <w:t>- 年齢群: 20s, 30s, 40s, 50s, 60s, 70s</w:t>
-      </w:r>
-    </w:p>
-    <w:p>
-      <w:r>
-        <w:t>- 適合の単位: 適合率は原則「症例（合成閾値セット）単位」。G2b・G4bのみ閾値点単位。</w:t>
-      </w:r>
-    </w:p>
-    <w:p>
-      <w:r>
-        <w:t>- Carhart様: seed付き一様乱数によるBernoulli試行（rand()&lt;0.8）。決定論的に80%へ割付してはいない。</w:t>
+        <w:t>版：電子付録1 v2.31（2026-09-04）。対応原稿：manuscript_IgakuKensa_AudioScopeEDU_technical_validity_JAMT_v2.31.docx。T6aとT6b、T6cとT6dは、それぞれ同一の200件について付与の有無と形を確認したものであり、付与例を別に200件集めた試験ではない。</w:t>
       </w:r>
     </w:p>
     <w:p>
@@ -60,132 +30,52 @@
         <w:pStyle w:val="Heading2"/>
       </w:pPr>
       <w:r>
-        <w:t>適合率（適用対象別）</w:t>
+        <w:t>1．検証の概要</w:t>
       </w:r>
     </w:p>
     <w:p>
       <w:r>
-        <w:t>| ID | 項目 | 適合 | 適用n | 率% | メモ |</w:t>
+        <w:t>・実行日時：2026-09-04T14:18:50.939Z（Node.js v22.20.0 / darwin / audioscope-edu 1.0.0）</w:t>
       </w:r>
     </w:p>
     <w:p>
       <w:r>
-        <w:t>|----|------|------|-------|-----|------|</w:t>
+        <w:t>・生成件数：正常および9種類の著者定義の教育用聴力像パターン × 6年齢群 × 男女 × 4段階の程度 × 各20件 ＝ 9,600件</w:t>
       </w:r>
     </w:p>
     <w:p>
       <w:r>
-        <w:t>| G0 | 要因組合せ・合成閾値セット数 | 9600/9600 | 9600 | 100 | 10プロファイル(正常1+疾患9)×6年齢×2性別×4程度×20seed |</w:t>
+        <w:t>・適合の単位：原則として症例（合成閾値セット）単位。G2b・G4bのみ閾値点単位。</w:t>
       </w:r>
     </w:p>
     <w:p>
       <w:r>
-        <w:t>| G1 | 条件反映（症例単位） | 9600/9600 | 9600 | 100 |  |</w:t>
+        <w:t>・検証スクリプトは生成プログラムとは別ファイルに判定関数を実装した。症例生成のため生成関数を呼び出すが、合否判定式は生成器内部の拘束ルーチンを共有しない。一部の定数（最小ABG床など）は双方に同値を重複定義し、凍結正解表と突合して管理した。同一著者・同一仕様に基づく確認であり、外部機関による第三者検証ではない。</w:t>
       </w:r>
     </w:p>
     <w:p>
       <w:r>
-        <w:t>| G2a | 5 dB丸め（症例単位：全閾値が5の倍数） | 9600/9600 | 9600 | 100 |  |</w:t>
+        <w:t>・C5-dipの判定：程度が軽度以上の騒音性難聴で、左右とも 4 kHz気導が2 kHzおよび8 kHzよりそれぞれ10 dB以上（Colesらを参考にした著者設定）。</w:t>
       </w:r>
     </w:p>
     <w:p>
       <w:r>
-        <w:t>| G2b | 5 dB丸め（閾値点単位） | 230400/230400 | 230400 | 100 |  |</w:t>
+        <w:t>・Carhart様変化：seed付き一様乱数によるBernoulli試行（発現確率80%）。決定論的に80%へ割付してはいない。付与率の許容帯70–90%および急性中耳炎混合型の許容帯40–60%は凍結正解表で事前設定し、95%信頼区間はWilson法で算出した。</w:t>
       </w:r>
     </w:p>
     <w:p>
       <w:r>
-        <w:t>| G4a | 周波数別上下限（症例単位：数値閾値がP4範囲内） | 9600/9600 | 9600 | 100 | 境界値＝上下限一致は適合。超過・下回は不適合 |</w:t>
+        <w:t>・急性中耳炎の混合型：程度≥1で教育用Bernoulli試行（付与率50%）。臨床発生率の再現ではない。最小ABG床は滲出性中耳炎と同一。</w:t>
       </w:r>
     </w:p>
     <w:p>
       <w:r>
-        <w:t>| G4b | 周波数別上下限（閾値点単位） | 230400/230400 | 230400 | 100 |  |</w:t>
+        <w:t>・ISO 7029:2017を教育用参照値として使用し、修正票Amd 1:2024は未反映。検証グリッドは20～70歳代であり、18歳未満は対象外。</w:t>
       </w:r>
     </w:p>
     <w:p>
       <w:r>
-        <w:t>| G3-Normal | Normal: 過大ABGなし（症例単位） | 960/960 | 960 | 100 |  |</w:t>
-      </w:r>
-    </w:p>
-    <w:p>
-      <w:r>
-        <w:t>| G3-SNHL | 感音: BC≤AC+5（症例単位） | 4800/4800 | 4800 | 100 |  |</w:t>
-      </w:r>
-    </w:p>
-    <w:p>
-      <w:r>
-        <w:t>| G3-CHL | 伝音系4パターン: 最小ABG（症例単位。急性中耳炎の混合型を含む） | 3840/3840 | 3840 | 100 |  |</w:t>
-      </w:r>
-    </w:p>
-    <w:p>
-      <w:r>
-        <w:t>| G3-Noise | C5-dip: 4k≥2k+10 かつ 4k≥8k+10（程度≥1） | 720/720 | 720 | 100 | Coles参考の著者設定（10 dB床） |</w:t>
-      </w:r>
-    </w:p>
-    <w:p>
-      <w:r>
-        <w:t>| G3-SuddenLat | 突発一側差≥30 dB（程度≥1・0.5/1/2 kHz平均） | 720/720 | 720 | 100 |  |</w:t>
-      </w:r>
-    </w:p>
-    <w:p>
-      <w:r>
-        <w:t>| G3-MumpsFloor | ムンプス: 病側meanAC≥70 かつ 一側差≥55（程度≥1） | 720/720 | 720 | 100 |  |</w:t>
-      </w:r>
-    </w:p>
-    <w:p>
-      <w:r>
-        <w:t>| G3-CarhartGeom | Carhart様幾何（発現例のみ） | 576/576 | 576 | 100 |  |</w:t>
-      </w:r>
-    </w:p>
-    <w:p>
-      <w:r>
-        <w:t>| G3-AOM-Mixed | AOM混合型: 4k BC&gt;0.5k BC（付与例） | 361/361 | 361 | 100 |  |</w:t>
-      </w:r>
-    </w:p>
-    <w:p>
-      <w:r>
-        <w:t>| T1 | 年齢効果 SNHL_Age（70s−20s, 4–8k平均AC） | 200/200 | 200 | 100 | 差の中央値 42.5 dB (IQR 37.5–47.5) |</w:t>
-      </w:r>
-    </w:p>
-    <w:p>
-      <w:r>
-        <w:t>| T8 | 程度の非減少（正常以外・同一seed・一側は患側固定） | 540/540 | 540 | 100 | SNHL_Age:60/60; SNHL_NoiseNotch:60/60; SNHL_Meniere:60/60; SNHL_Sudden:60/60; SNHL_Mumps:60/60; CHL_OME:60/60; CHL_AOM:60/60; CHL_Otosclerosis:60/60; CHL_OssicularDiscontinuity:60/60 |</w:t>
-      </w:r>
-    </w:p>
-    <w:p>
-      <w:r>
-        <w:t>| T7 | Sudden一側差≥30 dB（焦点: 程度2固定） | 200/200 | 200 | 100 | 焦点差中央値 51.7 dB（グリッドの程度≥1規則と同じ30 dB床） |</w:t>
-      </w:r>
-    </w:p>
-    <w:p>
-      <w:r>
-        <w:t>| T6a | Carhart様・付与の有無（期待80%） | 160/200 | 200 | 80 | 同じ200件での付与 160/200=80.0% (95%CI 73.9–85.0%)。許容帯70–90%のため試験合格 |</w:t>
-      </w:r>
-    </w:p>
-    <w:p>
-      <w:r>
-        <w:t>| T6b | Carhart様・付与例の形（T6aと同じ200件） | 160/160 | 160 | 100 | T6aで付与された160件の形（160/160） |</w:t>
-      </w:r>
-    </w:p>
-    <w:p>
-      <w:r>
-        <w:t>| T6c | AOM混合型・付与の有無（教育用50%） | 101/200 | 200 | 50.5 | 同じ200件での付与 101/200=50.5% (95%CI 43.6–57.4%)。許容帯40–60%のため試験合格。臨床発生率ではない |</w:t>
-      </w:r>
-    </w:p>
-    <w:p>
-      <w:r>
-        <w:t>| T6d | AOM混合型・付与例の形（T6cと同じ200件） | 101/101 | 101 | 100 | T6cで付与された101件の形（101/101） |</w:t>
-      </w:r>
-    </w:p>
-    <w:p>
-      <w:r>
-        <w:t>| T10 | seed固定の決定論的再現（不一致0を目標） | 200/200 | 200 | 100 | 不一致 0 |</w:t>
-      </w:r>
-    </w:p>
-    <w:p>
-      <w:r>
-        <w:t>| T11 | 同一条件・異seedの出力多様性（記述・全件不一致は非要求） | 200/200 | 200 | 100 | SNHL_NoiseNotch:ユニーク200/200・隣接不一致199/199; CHL_OME:ユニーク200/200・隣接不一致199/199; Normal:ユニーク200/200・隣接不一致199/199 |</w:t>
+        <w:t>・本付録は集計結果と項目識別番号を示す。ソースコード上の完全な判定式、seed一覧、実装版ハッシュの公開（例：リポジトリ附属資料またはDOI付与）は今後検討する。</w:t>
       </w:r>
     </w:p>
     <w:p>
@@ -193,117 +83,2433 @@
         <w:pStyle w:val="Heading2"/>
       </w:pPr>
       <w:r>
-        <w:t>記述統計（グリッド由来）</w:t>
+        <w:t>1b．ISO 7029:2017に基づく教育用参照値の要約（中央値）</w:t>
       </w:r>
     </w:p>
     <w:p>
       <w:r>
-        <w:t>- 伝音ABG（病側・BC周波数・一括）: n=19200, 中央値15.0dB (IQR 10.0–25.0, 範囲 -5.0–50.0)</w:t>
+        <w:t>規格本文の表は転載しない。実装した教育用JSONから、気導中央値（dB HL）の要約を示す。0.125 kHzはISO表にないため教育用に隣接帯から補間・拘束している。骨導基準はISOが直接規定するものではなく、気骨導関係の著者規則から生成する。</w:t>
+      </w:r>
+    </w:p>
+    <w:tbl>
+      <w:tblPr>
+        <w:tblStyle w:val="TableGrid"/>
+        <w:tblW w:type="auto" w:w="0"/>
+        <w:tblLook w:firstColumn="1" w:firstRow="1" w:lastColumn="0" w:lastRow="0" w:noHBand="0" w:noVBand="1" w:val="04A0"/>
+      </w:tblPr>
+      <w:tblGrid>
+        <w:gridCol w:w="1234"/>
+        <w:gridCol w:w="1234"/>
+        <w:gridCol w:w="1234"/>
+        <w:gridCol w:w="1234"/>
+        <w:gridCol w:w="1234"/>
+        <w:gridCol w:w="1234"/>
+        <w:gridCol w:w="1234"/>
+      </w:tblGrid>
+      <w:tr>
+        <w:tc>
+          <w:tcPr>
+            <w:tcW w:type="dxa" w:w="1234"/>
+          </w:tcPr>
+          <w:p>
+            <w:r>
+              <w:t>性別</w:t>
+            </w:r>
+          </w:p>
+        </w:tc>
+        <w:tc>
+          <w:tcPr>
+            <w:tcW w:type="dxa" w:w="1234"/>
+          </w:tcPr>
+          <w:p>
+            <w:r>
+              <w:t>年齢群</w:t>
+            </w:r>
+          </w:p>
+        </w:tc>
+        <w:tc>
+          <w:tcPr>
+            <w:tcW w:type="dxa" w:w="1234"/>
+          </w:tcPr>
+          <w:p>
+            <w:r>
+              <w:t>0.5 kHz</w:t>
+            </w:r>
+          </w:p>
+        </w:tc>
+        <w:tc>
+          <w:tcPr>
+            <w:tcW w:type="dxa" w:w="1234"/>
+          </w:tcPr>
+          <w:p>
+            <w:r>
+              <w:t>1 kHz</w:t>
+            </w:r>
+          </w:p>
+        </w:tc>
+        <w:tc>
+          <w:tcPr>
+            <w:tcW w:type="dxa" w:w="1234"/>
+          </w:tcPr>
+          <w:p>
+            <w:r>
+              <w:t>2 kHz</w:t>
+            </w:r>
+          </w:p>
+        </w:tc>
+        <w:tc>
+          <w:tcPr>
+            <w:tcW w:type="dxa" w:w="1234"/>
+          </w:tcPr>
+          <w:p>
+            <w:r>
+              <w:t>4 kHz</w:t>
+            </w:r>
+          </w:p>
+        </w:tc>
+        <w:tc>
+          <w:tcPr>
+            <w:tcW w:type="dxa" w:w="1234"/>
+          </w:tcPr>
+          <w:p>
+            <w:r>
+              <w:t>8 kHz</w:t>
+            </w:r>
+          </w:p>
+        </w:tc>
+      </w:tr>
+      <w:tr>
+        <w:tc>
+          <w:tcPr>
+            <w:tcW w:type="dxa" w:w="1234"/>
+          </w:tcPr>
+          <w:p>
+            <w:r>
+              <w:t>男性</w:t>
+            </w:r>
+          </w:p>
+        </w:tc>
+        <w:tc>
+          <w:tcPr>
+            <w:tcW w:type="dxa" w:w="1234"/>
+          </w:tcPr>
+          <w:p>
+            <w:r>
+              <w:t>20s</w:t>
+            </w:r>
+          </w:p>
+        </w:tc>
+        <w:tc>
+          <w:tcPr>
+            <w:tcW w:type="dxa" w:w="1234"/>
+          </w:tcPr>
+          <w:p>
+            <w:r>
+              <w:t>0.0</w:t>
+            </w:r>
+          </w:p>
+        </w:tc>
+        <w:tc>
+          <w:tcPr>
+            <w:tcW w:type="dxa" w:w="1234"/>
+          </w:tcPr>
+          <w:p>
+            <w:r>
+              <w:t>0.0</w:t>
+            </w:r>
+          </w:p>
+        </w:tc>
+        <w:tc>
+          <w:tcPr>
+            <w:tcW w:type="dxa" w:w="1234"/>
+          </w:tcPr>
+          <w:p>
+            <w:r>
+              <w:t>0.0</w:t>
+            </w:r>
+          </w:p>
+        </w:tc>
+        <w:tc>
+          <w:tcPr>
+            <w:tcW w:type="dxa" w:w="1234"/>
+          </w:tcPr>
+          <w:p>
+            <w:r>
+              <w:t>0.0</w:t>
+            </w:r>
+          </w:p>
+        </w:tc>
+        <w:tc>
+          <w:tcPr>
+            <w:tcW w:type="dxa" w:w="1234"/>
+          </w:tcPr>
+          <w:p>
+            <w:r>
+              <w:t>0.0</w:t>
+            </w:r>
+          </w:p>
+        </w:tc>
+      </w:tr>
+      <w:tr>
+        <w:tc>
+          <w:tcPr>
+            <w:tcW w:type="dxa" w:w="1234"/>
+          </w:tcPr>
+          <w:p>
+            <w:r>
+              <w:t>男性</w:t>
+            </w:r>
+          </w:p>
+        </w:tc>
+        <w:tc>
+          <w:tcPr>
+            <w:tcW w:type="dxa" w:w="1234"/>
+          </w:tcPr>
+          <w:p>
+            <w:r>
+              <w:t>50s</w:t>
+            </w:r>
+          </w:p>
+        </w:tc>
+        <w:tc>
+          <w:tcPr>
+            <w:tcW w:type="dxa" w:w="1234"/>
+          </w:tcPr>
+          <w:p>
+            <w:r>
+              <w:t>3.0</w:t>
+            </w:r>
+          </w:p>
+        </w:tc>
+        <w:tc>
+          <w:tcPr>
+            <w:tcW w:type="dxa" w:w="1234"/>
+          </w:tcPr>
+          <w:p>
+            <w:r>
+              <w:t>4.0</w:t>
+            </w:r>
+          </w:p>
+        </w:tc>
+        <w:tc>
+          <w:tcPr>
+            <w:tcW w:type="dxa" w:w="1234"/>
+          </w:tcPr>
+          <w:p>
+            <w:r>
+              <w:t>6.5</w:t>
+            </w:r>
+          </w:p>
+        </w:tc>
+        <w:tc>
+          <w:tcPr>
+            <w:tcW w:type="dxa" w:w="1234"/>
+          </w:tcPr>
+          <w:p>
+            <w:r>
+              <w:t>10.7</w:t>
+            </w:r>
+          </w:p>
+        </w:tc>
+        <w:tc>
+          <w:tcPr>
+            <w:tcW w:type="dxa" w:w="1234"/>
+          </w:tcPr>
+          <w:p>
+            <w:r>
+              <w:t>16.1</w:t>
+            </w:r>
+          </w:p>
+        </w:tc>
+      </w:tr>
+      <w:tr>
+        <w:tc>
+          <w:tcPr>
+            <w:tcW w:type="dxa" w:w="1234"/>
+          </w:tcPr>
+          <w:p>
+            <w:r>
+              <w:t>男性</w:t>
+            </w:r>
+          </w:p>
+        </w:tc>
+        <w:tc>
+          <w:tcPr>
+            <w:tcW w:type="dxa" w:w="1234"/>
+          </w:tcPr>
+          <w:p>
+            <w:r>
+              <w:t>70s</w:t>
+            </w:r>
+          </w:p>
+        </w:tc>
+        <w:tc>
+          <w:tcPr>
+            <w:tcW w:type="dxa" w:w="1234"/>
+          </w:tcPr>
+          <w:p>
+            <w:r>
+              <w:t>10.4</w:t>
+            </w:r>
+          </w:p>
+        </w:tc>
+        <w:tc>
+          <w:tcPr>
+            <w:tcW w:type="dxa" w:w="1234"/>
+          </w:tcPr>
+          <w:p>
+            <w:r>
+              <w:t>13.4</w:t>
+            </w:r>
+          </w:p>
+        </w:tc>
+        <w:tc>
+          <w:tcPr>
+            <w:tcW w:type="dxa" w:w="1234"/>
+          </w:tcPr>
+          <w:p>
+            <w:r>
+              <w:t>20.8</w:t>
+            </w:r>
+          </w:p>
+        </w:tc>
+        <w:tc>
+          <w:tcPr>
+            <w:tcW w:type="dxa" w:w="1234"/>
+          </w:tcPr>
+          <w:p>
+            <w:r>
+              <w:t>33.2</w:t>
+            </w:r>
+          </w:p>
+        </w:tc>
+        <w:tc>
+          <w:tcPr>
+            <w:tcW w:type="dxa" w:w="1234"/>
+          </w:tcPr>
+          <w:p>
+            <w:r>
+              <w:t>50.0</w:t>
+            </w:r>
+          </w:p>
+        </w:tc>
+      </w:tr>
+      <w:tr>
+        <w:tc>
+          <w:tcPr>
+            <w:tcW w:type="dxa" w:w="1234"/>
+          </w:tcPr>
+          <w:p>
+            <w:r>
+              <w:t>女性</w:t>
+            </w:r>
+          </w:p>
+        </w:tc>
+        <w:tc>
+          <w:tcPr>
+            <w:tcW w:type="dxa" w:w="1234"/>
+          </w:tcPr>
+          <w:p>
+            <w:r>
+              <w:t>20s</w:t>
+            </w:r>
+          </w:p>
+        </w:tc>
+        <w:tc>
+          <w:tcPr>
+            <w:tcW w:type="dxa" w:w="1234"/>
+          </w:tcPr>
+          <w:p>
+            <w:r>
+              <w:t>0.0</w:t>
+            </w:r>
+          </w:p>
+        </w:tc>
+        <w:tc>
+          <w:tcPr>
+            <w:tcW w:type="dxa" w:w="1234"/>
+          </w:tcPr>
+          <w:p>
+            <w:r>
+              <w:t>0.0</w:t>
+            </w:r>
+          </w:p>
+        </w:tc>
+        <w:tc>
+          <w:tcPr>
+            <w:tcW w:type="dxa" w:w="1234"/>
+          </w:tcPr>
+          <w:p>
+            <w:r>
+              <w:t>0.0</w:t>
+            </w:r>
+          </w:p>
+        </w:tc>
+        <w:tc>
+          <w:tcPr>
+            <w:tcW w:type="dxa" w:w="1234"/>
+          </w:tcPr>
+          <w:p>
+            <w:r>
+              <w:t>0.0</w:t>
+            </w:r>
+          </w:p>
+        </w:tc>
+        <w:tc>
+          <w:tcPr>
+            <w:tcW w:type="dxa" w:w="1234"/>
+          </w:tcPr>
+          <w:p>
+            <w:r>
+              <w:t>0.0</w:t>
+            </w:r>
+          </w:p>
+        </w:tc>
+      </w:tr>
+      <w:tr>
+        <w:tc>
+          <w:tcPr>
+            <w:tcW w:type="dxa" w:w="1234"/>
+          </w:tcPr>
+          <w:p>
+            <w:r>
+              <w:t>女性</w:t>
+            </w:r>
+          </w:p>
+        </w:tc>
+        <w:tc>
+          <w:tcPr>
+            <w:tcW w:type="dxa" w:w="1234"/>
+          </w:tcPr>
+          <w:p>
+            <w:r>
+              <w:t>50s</w:t>
+            </w:r>
+          </w:p>
+        </w:tc>
+        <w:tc>
+          <w:tcPr>
+            <w:tcW w:type="dxa" w:w="1234"/>
+          </w:tcPr>
+          <w:p>
+            <w:r>
+              <w:t>3.1</w:t>
+            </w:r>
+          </w:p>
+        </w:tc>
+        <w:tc>
+          <w:tcPr>
+            <w:tcW w:type="dxa" w:w="1234"/>
+          </w:tcPr>
+          <w:p>
+            <w:r>
+              <w:t>3.7</w:t>
+            </w:r>
+          </w:p>
+        </w:tc>
+        <w:tc>
+          <w:tcPr>
+            <w:tcW w:type="dxa" w:w="1234"/>
+          </w:tcPr>
+          <w:p>
+            <w:r>
+              <w:t>5.0</w:t>
+            </w:r>
+          </w:p>
+        </w:tc>
+        <w:tc>
+          <w:tcPr>
+            <w:tcW w:type="dxa" w:w="1234"/>
+          </w:tcPr>
+          <w:p>
+            <w:r>
+              <w:t>7.4</w:t>
+            </w:r>
+          </w:p>
+        </w:tc>
+        <w:tc>
+          <w:tcPr>
+            <w:tcW w:type="dxa" w:w="1234"/>
+          </w:tcPr>
+          <w:p>
+            <w:r>
+              <w:t>11.9</w:t>
+            </w:r>
+          </w:p>
+        </w:tc>
+      </w:tr>
+      <w:tr>
+        <w:tc>
+          <w:tcPr>
+            <w:tcW w:type="dxa" w:w="1234"/>
+          </w:tcPr>
+          <w:p>
+            <w:r>
+              <w:t>女性</w:t>
+            </w:r>
+          </w:p>
+        </w:tc>
+        <w:tc>
+          <w:tcPr>
+            <w:tcW w:type="dxa" w:w="1234"/>
+          </w:tcPr>
+          <w:p>
+            <w:r>
+              <w:t>70s</w:t>
+            </w:r>
+          </w:p>
+        </w:tc>
+        <w:tc>
+          <w:tcPr>
+            <w:tcW w:type="dxa" w:w="1234"/>
+          </w:tcPr>
+          <w:p>
+            <w:r>
+              <w:t>11.6</w:t>
+            </w:r>
+          </w:p>
+        </w:tc>
+        <w:tc>
+          <w:tcPr>
+            <w:tcW w:type="dxa" w:w="1234"/>
+          </w:tcPr>
+          <w:p>
+            <w:r>
+              <w:t>14.4</w:t>
+            </w:r>
+          </w:p>
+        </w:tc>
+        <w:tc>
+          <w:tcPr>
+            <w:tcW w:type="dxa" w:w="1234"/>
+          </w:tcPr>
+          <w:p>
+            <w:r>
+              <w:t>19.3</w:t>
+            </w:r>
+          </w:p>
+        </w:tc>
+        <w:tc>
+          <w:tcPr>
+            <w:tcW w:type="dxa" w:w="1234"/>
+          </w:tcPr>
+          <w:p>
+            <w:r>
+              <w:t>27.0</w:t>
+            </w:r>
+          </w:p>
+        </w:tc>
+        <w:tc>
+          <w:tcPr>
+            <w:tcW w:type="dxa" w:w="1234"/>
+          </w:tcPr>
+          <w:p>
+            <w:r>
+              <w:t>38.8</w:t>
+            </w:r>
+          </w:p>
+        </w:tc>
+      </w:tr>
+    </w:tbl>
+    <w:p>
+      <w:pPr>
+        <w:pStyle w:val="Heading2"/>
+      </w:pPr>
+      <w:r>
+        <w:t>2．適合率（適用対象別）</w:t>
+      </w:r>
+    </w:p>
+    <w:tbl>
+      <w:tblPr>
+        <w:tblStyle w:val="TableGrid"/>
+        <w:tblW w:type="auto" w:w="0"/>
+        <w:tblLook w:firstColumn="1" w:firstRow="1" w:lastColumn="0" w:lastRow="0" w:noHBand="0" w:noVBand="1" w:val="04A0"/>
+      </w:tblPr>
+      <w:tblGrid>
+        <w:gridCol w:w="1440"/>
+        <w:gridCol w:w="1440"/>
+        <w:gridCol w:w="1440"/>
+        <w:gridCol w:w="1440"/>
+        <w:gridCol w:w="1440"/>
+        <w:gridCol w:w="1440"/>
+      </w:tblGrid>
+      <w:tr>
+        <w:tc>
+          <w:tcPr>
+            <w:tcW w:type="dxa" w:w="1440"/>
+          </w:tcPr>
+          <w:p>
+            <w:r>
+              <w:t>ID</w:t>
+            </w:r>
+          </w:p>
+        </w:tc>
+        <w:tc>
+          <w:tcPr>
+            <w:tcW w:type="dxa" w:w="1440"/>
+          </w:tcPr>
+          <w:p>
+            <w:r>
+              <w:t>項目</w:t>
+            </w:r>
+          </w:p>
+        </w:tc>
+        <w:tc>
+          <w:tcPr>
+            <w:tcW w:type="dxa" w:w="1440"/>
+          </w:tcPr>
+          <w:p>
+            <w:r>
+              <w:t>適合</w:t>
+            </w:r>
+          </w:p>
+        </w:tc>
+        <w:tc>
+          <w:tcPr>
+            <w:tcW w:type="dxa" w:w="1440"/>
+          </w:tcPr>
+          <w:p>
+            <w:r>
+              <w:t>適用n</w:t>
+            </w:r>
+          </w:p>
+        </w:tc>
+        <w:tc>
+          <w:tcPr>
+            <w:tcW w:type="dxa" w:w="1440"/>
+          </w:tcPr>
+          <w:p>
+            <w:r>
+              <w:t>率%</w:t>
+            </w:r>
+          </w:p>
+        </w:tc>
+        <w:tc>
+          <w:tcPr>
+            <w:tcW w:type="dxa" w:w="1440"/>
+          </w:tcPr>
+          <w:p>
+            <w:r>
+              <w:t>メモ</w:t>
+            </w:r>
+          </w:p>
+        </w:tc>
+      </w:tr>
+      <w:tr>
+        <w:tc>
+          <w:tcPr>
+            <w:tcW w:type="dxa" w:w="1440"/>
+          </w:tcPr>
+          <w:p>
+            <w:r>
+              <w:t>G0</w:t>
+            </w:r>
+          </w:p>
+        </w:tc>
+        <w:tc>
+          <w:tcPr>
+            <w:tcW w:type="dxa" w:w="1440"/>
+          </w:tcPr>
+          <w:p>
+            <w:r>
+              <w:t>要因組合せ・合成閾値セット数</w:t>
+            </w:r>
+          </w:p>
+        </w:tc>
+        <w:tc>
+          <w:tcPr>
+            <w:tcW w:type="dxa" w:w="1440"/>
+          </w:tcPr>
+          <w:p>
+            <w:r>
+              <w:t>9600/9600</w:t>
+            </w:r>
+          </w:p>
+        </w:tc>
+        <w:tc>
+          <w:tcPr>
+            <w:tcW w:type="dxa" w:w="1440"/>
+          </w:tcPr>
+          <w:p>
+            <w:r>
+              <w:t>9600</w:t>
+            </w:r>
+          </w:p>
+        </w:tc>
+        <w:tc>
+          <w:tcPr>
+            <w:tcW w:type="dxa" w:w="1440"/>
+          </w:tcPr>
+          <w:p>
+            <w:r>
+              <w:t>100</w:t>
+            </w:r>
+          </w:p>
+        </w:tc>
+        <w:tc>
+          <w:tcPr>
+            <w:tcW w:type="dxa" w:w="1440"/>
+          </w:tcPr>
+          <w:p>
+            <w:r>
+              <w:t>10プロファイル(正常1+疾患9)×6年齢×2性別×4程度×20seed</w:t>
+            </w:r>
+          </w:p>
+        </w:tc>
+      </w:tr>
+      <w:tr>
+        <w:tc>
+          <w:tcPr>
+            <w:tcW w:type="dxa" w:w="1440"/>
+          </w:tcPr>
+          <w:p>
+            <w:r>
+              <w:t>G1</w:t>
+            </w:r>
+          </w:p>
+        </w:tc>
+        <w:tc>
+          <w:tcPr>
+            <w:tcW w:type="dxa" w:w="1440"/>
+          </w:tcPr>
+          <w:p>
+            <w:r>
+              <w:t>条件反映（症例単位）</w:t>
+            </w:r>
+          </w:p>
+        </w:tc>
+        <w:tc>
+          <w:tcPr>
+            <w:tcW w:type="dxa" w:w="1440"/>
+          </w:tcPr>
+          <w:p>
+            <w:r>
+              <w:t>9600/9600</w:t>
+            </w:r>
+          </w:p>
+        </w:tc>
+        <w:tc>
+          <w:tcPr>
+            <w:tcW w:type="dxa" w:w="1440"/>
+          </w:tcPr>
+          <w:p>
+            <w:r>
+              <w:t>9600</w:t>
+            </w:r>
+          </w:p>
+        </w:tc>
+        <w:tc>
+          <w:tcPr>
+            <w:tcW w:type="dxa" w:w="1440"/>
+          </w:tcPr>
+          <w:p>
+            <w:r>
+              <w:t>100</w:t>
+            </w:r>
+          </w:p>
+        </w:tc>
+        <w:tc>
+          <w:tcPr>
+            <w:tcW w:type="dxa" w:w="1440"/>
+          </w:tcPr>
+          <w:p>
+            <w:r/>
+          </w:p>
+        </w:tc>
+      </w:tr>
+      <w:tr>
+        <w:tc>
+          <w:tcPr>
+            <w:tcW w:type="dxa" w:w="1440"/>
+          </w:tcPr>
+          <w:p>
+            <w:r>
+              <w:t>G2a</w:t>
+            </w:r>
+          </w:p>
+        </w:tc>
+        <w:tc>
+          <w:tcPr>
+            <w:tcW w:type="dxa" w:w="1440"/>
+          </w:tcPr>
+          <w:p>
+            <w:r>
+              <w:t>5 dB丸め（症例単位：全閾値が5の倍数）</w:t>
+            </w:r>
+          </w:p>
+        </w:tc>
+        <w:tc>
+          <w:tcPr>
+            <w:tcW w:type="dxa" w:w="1440"/>
+          </w:tcPr>
+          <w:p>
+            <w:r>
+              <w:t>9600/9600</w:t>
+            </w:r>
+          </w:p>
+        </w:tc>
+        <w:tc>
+          <w:tcPr>
+            <w:tcW w:type="dxa" w:w="1440"/>
+          </w:tcPr>
+          <w:p>
+            <w:r>
+              <w:t>9600</w:t>
+            </w:r>
+          </w:p>
+        </w:tc>
+        <w:tc>
+          <w:tcPr>
+            <w:tcW w:type="dxa" w:w="1440"/>
+          </w:tcPr>
+          <w:p>
+            <w:r>
+              <w:t>100</w:t>
+            </w:r>
+          </w:p>
+        </w:tc>
+        <w:tc>
+          <w:tcPr>
+            <w:tcW w:type="dxa" w:w="1440"/>
+          </w:tcPr>
+          <w:p>
+            <w:r/>
+          </w:p>
+        </w:tc>
+      </w:tr>
+      <w:tr>
+        <w:tc>
+          <w:tcPr>
+            <w:tcW w:type="dxa" w:w="1440"/>
+          </w:tcPr>
+          <w:p>
+            <w:r>
+              <w:t>G2b</w:t>
+            </w:r>
+          </w:p>
+        </w:tc>
+        <w:tc>
+          <w:tcPr>
+            <w:tcW w:type="dxa" w:w="1440"/>
+          </w:tcPr>
+          <w:p>
+            <w:r>
+              <w:t>5 dB丸め（閾値点単位）</w:t>
+            </w:r>
+          </w:p>
+        </w:tc>
+        <w:tc>
+          <w:tcPr>
+            <w:tcW w:type="dxa" w:w="1440"/>
+          </w:tcPr>
+          <w:p>
+            <w:r>
+              <w:t>230400/230400</w:t>
+            </w:r>
+          </w:p>
+        </w:tc>
+        <w:tc>
+          <w:tcPr>
+            <w:tcW w:type="dxa" w:w="1440"/>
+          </w:tcPr>
+          <w:p>
+            <w:r>
+              <w:t>230400</w:t>
+            </w:r>
+          </w:p>
+        </w:tc>
+        <w:tc>
+          <w:tcPr>
+            <w:tcW w:type="dxa" w:w="1440"/>
+          </w:tcPr>
+          <w:p>
+            <w:r>
+              <w:t>100</w:t>
+            </w:r>
+          </w:p>
+        </w:tc>
+        <w:tc>
+          <w:tcPr>
+            <w:tcW w:type="dxa" w:w="1440"/>
+          </w:tcPr>
+          <w:p>
+            <w:r/>
+          </w:p>
+        </w:tc>
+      </w:tr>
+      <w:tr>
+        <w:tc>
+          <w:tcPr>
+            <w:tcW w:type="dxa" w:w="1440"/>
+          </w:tcPr>
+          <w:p>
+            <w:r>
+              <w:t>G4a</w:t>
+            </w:r>
+          </w:p>
+        </w:tc>
+        <w:tc>
+          <w:tcPr>
+            <w:tcW w:type="dxa" w:w="1440"/>
+          </w:tcPr>
+          <w:p>
+            <w:r>
+              <w:t>周波数別上下限（症例単位：数値閾値がP4範囲内）</w:t>
+            </w:r>
+          </w:p>
+        </w:tc>
+        <w:tc>
+          <w:tcPr>
+            <w:tcW w:type="dxa" w:w="1440"/>
+          </w:tcPr>
+          <w:p>
+            <w:r>
+              <w:t>9600/9600</w:t>
+            </w:r>
+          </w:p>
+        </w:tc>
+        <w:tc>
+          <w:tcPr>
+            <w:tcW w:type="dxa" w:w="1440"/>
+          </w:tcPr>
+          <w:p>
+            <w:r>
+              <w:t>9600</w:t>
+            </w:r>
+          </w:p>
+        </w:tc>
+        <w:tc>
+          <w:tcPr>
+            <w:tcW w:type="dxa" w:w="1440"/>
+          </w:tcPr>
+          <w:p>
+            <w:r>
+              <w:t>100</w:t>
+            </w:r>
+          </w:p>
+        </w:tc>
+        <w:tc>
+          <w:tcPr>
+            <w:tcW w:type="dxa" w:w="1440"/>
+          </w:tcPr>
+          <w:p>
+            <w:r>
+              <w:t>境界値＝上下限一致は適合。超過・下回は不適合</w:t>
+            </w:r>
+          </w:p>
+        </w:tc>
+      </w:tr>
+      <w:tr>
+        <w:tc>
+          <w:tcPr>
+            <w:tcW w:type="dxa" w:w="1440"/>
+          </w:tcPr>
+          <w:p>
+            <w:r>
+              <w:t>G4b</w:t>
+            </w:r>
+          </w:p>
+        </w:tc>
+        <w:tc>
+          <w:tcPr>
+            <w:tcW w:type="dxa" w:w="1440"/>
+          </w:tcPr>
+          <w:p>
+            <w:r>
+              <w:t>周波数別上下限（閾値点単位）</w:t>
+            </w:r>
+          </w:p>
+        </w:tc>
+        <w:tc>
+          <w:tcPr>
+            <w:tcW w:type="dxa" w:w="1440"/>
+          </w:tcPr>
+          <w:p>
+            <w:r>
+              <w:t>230400/230400</w:t>
+            </w:r>
+          </w:p>
+        </w:tc>
+        <w:tc>
+          <w:tcPr>
+            <w:tcW w:type="dxa" w:w="1440"/>
+          </w:tcPr>
+          <w:p>
+            <w:r>
+              <w:t>230400</w:t>
+            </w:r>
+          </w:p>
+        </w:tc>
+        <w:tc>
+          <w:tcPr>
+            <w:tcW w:type="dxa" w:w="1440"/>
+          </w:tcPr>
+          <w:p>
+            <w:r>
+              <w:t>100</w:t>
+            </w:r>
+          </w:p>
+        </w:tc>
+        <w:tc>
+          <w:tcPr>
+            <w:tcW w:type="dxa" w:w="1440"/>
+          </w:tcPr>
+          <w:p>
+            <w:r/>
+          </w:p>
+        </w:tc>
+      </w:tr>
+      <w:tr>
+        <w:tc>
+          <w:tcPr>
+            <w:tcW w:type="dxa" w:w="1440"/>
+          </w:tcPr>
+          <w:p>
+            <w:r>
+              <w:t>G3-Normal</w:t>
+            </w:r>
+          </w:p>
+        </w:tc>
+        <w:tc>
+          <w:tcPr>
+            <w:tcW w:type="dxa" w:w="1440"/>
+          </w:tcPr>
+          <w:p>
+            <w:r>
+              <w:t>Normal: 過大ABGなし（症例単位）</w:t>
+            </w:r>
+          </w:p>
+        </w:tc>
+        <w:tc>
+          <w:tcPr>
+            <w:tcW w:type="dxa" w:w="1440"/>
+          </w:tcPr>
+          <w:p>
+            <w:r>
+              <w:t>960/960</w:t>
+            </w:r>
+          </w:p>
+        </w:tc>
+        <w:tc>
+          <w:tcPr>
+            <w:tcW w:type="dxa" w:w="1440"/>
+          </w:tcPr>
+          <w:p>
+            <w:r>
+              <w:t>960</w:t>
+            </w:r>
+          </w:p>
+        </w:tc>
+        <w:tc>
+          <w:tcPr>
+            <w:tcW w:type="dxa" w:w="1440"/>
+          </w:tcPr>
+          <w:p>
+            <w:r>
+              <w:t>100</w:t>
+            </w:r>
+          </w:p>
+        </w:tc>
+        <w:tc>
+          <w:tcPr>
+            <w:tcW w:type="dxa" w:w="1440"/>
+          </w:tcPr>
+          <w:p>
+            <w:r/>
+          </w:p>
+        </w:tc>
+      </w:tr>
+      <w:tr>
+        <w:tc>
+          <w:tcPr>
+            <w:tcW w:type="dxa" w:w="1440"/>
+          </w:tcPr>
+          <w:p>
+            <w:r>
+              <w:t>G3-SNHL</w:t>
+            </w:r>
+          </w:p>
+        </w:tc>
+        <w:tc>
+          <w:tcPr>
+            <w:tcW w:type="dxa" w:w="1440"/>
+          </w:tcPr>
+          <w:p>
+            <w:r>
+              <w:t>感音: BC≤AC+5（症例単位）</w:t>
+            </w:r>
+          </w:p>
+        </w:tc>
+        <w:tc>
+          <w:tcPr>
+            <w:tcW w:type="dxa" w:w="1440"/>
+          </w:tcPr>
+          <w:p>
+            <w:r>
+              <w:t>4800/4800</w:t>
+            </w:r>
+          </w:p>
+        </w:tc>
+        <w:tc>
+          <w:tcPr>
+            <w:tcW w:type="dxa" w:w="1440"/>
+          </w:tcPr>
+          <w:p>
+            <w:r>
+              <w:t>4800</w:t>
+            </w:r>
+          </w:p>
+        </w:tc>
+        <w:tc>
+          <w:tcPr>
+            <w:tcW w:type="dxa" w:w="1440"/>
+          </w:tcPr>
+          <w:p>
+            <w:r>
+              <w:t>100</w:t>
+            </w:r>
+          </w:p>
+        </w:tc>
+        <w:tc>
+          <w:tcPr>
+            <w:tcW w:type="dxa" w:w="1440"/>
+          </w:tcPr>
+          <w:p>
+            <w:r/>
+          </w:p>
+        </w:tc>
+      </w:tr>
+      <w:tr>
+        <w:tc>
+          <w:tcPr>
+            <w:tcW w:type="dxa" w:w="1440"/>
+          </w:tcPr>
+          <w:p>
+            <w:r>
+              <w:t>G3-CHL</w:t>
+            </w:r>
+          </w:p>
+        </w:tc>
+        <w:tc>
+          <w:tcPr>
+            <w:tcW w:type="dxa" w:w="1440"/>
+          </w:tcPr>
+          <w:p>
+            <w:r>
+              <w:t>伝音系4パターン: 最小ABG（症例単位。急性中耳炎の混合型を含む）</w:t>
+            </w:r>
+          </w:p>
+        </w:tc>
+        <w:tc>
+          <w:tcPr>
+            <w:tcW w:type="dxa" w:w="1440"/>
+          </w:tcPr>
+          <w:p>
+            <w:r>
+              <w:t>3840/3840</w:t>
+            </w:r>
+          </w:p>
+        </w:tc>
+        <w:tc>
+          <w:tcPr>
+            <w:tcW w:type="dxa" w:w="1440"/>
+          </w:tcPr>
+          <w:p>
+            <w:r>
+              <w:t>3840</w:t>
+            </w:r>
+          </w:p>
+        </w:tc>
+        <w:tc>
+          <w:tcPr>
+            <w:tcW w:type="dxa" w:w="1440"/>
+          </w:tcPr>
+          <w:p>
+            <w:r>
+              <w:t>100</w:t>
+            </w:r>
+          </w:p>
+        </w:tc>
+        <w:tc>
+          <w:tcPr>
+            <w:tcW w:type="dxa" w:w="1440"/>
+          </w:tcPr>
+          <w:p>
+            <w:r/>
+          </w:p>
+        </w:tc>
+      </w:tr>
+      <w:tr>
+        <w:tc>
+          <w:tcPr>
+            <w:tcW w:type="dxa" w:w="1440"/>
+          </w:tcPr>
+          <w:p>
+            <w:r>
+              <w:t>G3-Noise</w:t>
+            </w:r>
+          </w:p>
+        </w:tc>
+        <w:tc>
+          <w:tcPr>
+            <w:tcW w:type="dxa" w:w="1440"/>
+          </w:tcPr>
+          <w:p>
+            <w:r>
+              <w:t>C5-dip: 4k≥2k+10 かつ 4k≥8k+10（程度≥1）</w:t>
+            </w:r>
+          </w:p>
+        </w:tc>
+        <w:tc>
+          <w:tcPr>
+            <w:tcW w:type="dxa" w:w="1440"/>
+          </w:tcPr>
+          <w:p>
+            <w:r>
+              <w:t>720/720</w:t>
+            </w:r>
+          </w:p>
+        </w:tc>
+        <w:tc>
+          <w:tcPr>
+            <w:tcW w:type="dxa" w:w="1440"/>
+          </w:tcPr>
+          <w:p>
+            <w:r>
+              <w:t>720</w:t>
+            </w:r>
+          </w:p>
+        </w:tc>
+        <w:tc>
+          <w:tcPr>
+            <w:tcW w:type="dxa" w:w="1440"/>
+          </w:tcPr>
+          <w:p>
+            <w:r>
+              <w:t>100</w:t>
+            </w:r>
+          </w:p>
+        </w:tc>
+        <w:tc>
+          <w:tcPr>
+            <w:tcW w:type="dxa" w:w="1440"/>
+          </w:tcPr>
+          <w:p>
+            <w:r>
+              <w:t>Coles参考の著者設定（10 dB床）</w:t>
+            </w:r>
+          </w:p>
+        </w:tc>
+      </w:tr>
+      <w:tr>
+        <w:tc>
+          <w:tcPr>
+            <w:tcW w:type="dxa" w:w="1440"/>
+          </w:tcPr>
+          <w:p>
+            <w:r>
+              <w:t>G3-SuddenLat</w:t>
+            </w:r>
+          </w:p>
+        </w:tc>
+        <w:tc>
+          <w:tcPr>
+            <w:tcW w:type="dxa" w:w="1440"/>
+          </w:tcPr>
+          <w:p>
+            <w:r>
+              <w:t>突発一側差≥30 dB（程度≥1・0.5/1/2 kHz平均）</w:t>
+            </w:r>
+          </w:p>
+        </w:tc>
+        <w:tc>
+          <w:tcPr>
+            <w:tcW w:type="dxa" w:w="1440"/>
+          </w:tcPr>
+          <w:p>
+            <w:r>
+              <w:t>720/720</w:t>
+            </w:r>
+          </w:p>
+        </w:tc>
+        <w:tc>
+          <w:tcPr>
+            <w:tcW w:type="dxa" w:w="1440"/>
+          </w:tcPr>
+          <w:p>
+            <w:r>
+              <w:t>720</w:t>
+            </w:r>
+          </w:p>
+        </w:tc>
+        <w:tc>
+          <w:tcPr>
+            <w:tcW w:type="dxa" w:w="1440"/>
+          </w:tcPr>
+          <w:p>
+            <w:r>
+              <w:t>100</w:t>
+            </w:r>
+          </w:p>
+        </w:tc>
+        <w:tc>
+          <w:tcPr>
+            <w:tcW w:type="dxa" w:w="1440"/>
+          </w:tcPr>
+          <w:p>
+            <w:r/>
+          </w:p>
+        </w:tc>
+      </w:tr>
+      <w:tr>
+        <w:tc>
+          <w:tcPr>
+            <w:tcW w:type="dxa" w:w="1440"/>
+          </w:tcPr>
+          <w:p>
+            <w:r>
+              <w:t>G3-MumpsFloor</w:t>
+            </w:r>
+          </w:p>
+        </w:tc>
+        <w:tc>
+          <w:tcPr>
+            <w:tcW w:type="dxa" w:w="1440"/>
+          </w:tcPr>
+          <w:p>
+            <w:r>
+              <w:t>ムンプス: 病側meanAC≥70 かつ 一側差≥55（程度≥1）</w:t>
+            </w:r>
+          </w:p>
+        </w:tc>
+        <w:tc>
+          <w:tcPr>
+            <w:tcW w:type="dxa" w:w="1440"/>
+          </w:tcPr>
+          <w:p>
+            <w:r>
+              <w:t>720/720</w:t>
+            </w:r>
+          </w:p>
+        </w:tc>
+        <w:tc>
+          <w:tcPr>
+            <w:tcW w:type="dxa" w:w="1440"/>
+          </w:tcPr>
+          <w:p>
+            <w:r>
+              <w:t>720</w:t>
+            </w:r>
+          </w:p>
+        </w:tc>
+        <w:tc>
+          <w:tcPr>
+            <w:tcW w:type="dxa" w:w="1440"/>
+          </w:tcPr>
+          <w:p>
+            <w:r>
+              <w:t>100</w:t>
+            </w:r>
+          </w:p>
+        </w:tc>
+        <w:tc>
+          <w:tcPr>
+            <w:tcW w:type="dxa" w:w="1440"/>
+          </w:tcPr>
+          <w:p>
+            <w:r/>
+          </w:p>
+        </w:tc>
+      </w:tr>
+      <w:tr>
+        <w:tc>
+          <w:tcPr>
+            <w:tcW w:type="dxa" w:w="1440"/>
+          </w:tcPr>
+          <w:p>
+            <w:r>
+              <w:t>G3-CarhartGeom</w:t>
+            </w:r>
+          </w:p>
+        </w:tc>
+        <w:tc>
+          <w:tcPr>
+            <w:tcW w:type="dxa" w:w="1440"/>
+          </w:tcPr>
+          <w:p>
+            <w:r>
+              <w:t>Carhart様幾何（発現例のみ）</w:t>
+            </w:r>
+          </w:p>
+        </w:tc>
+        <w:tc>
+          <w:tcPr>
+            <w:tcW w:type="dxa" w:w="1440"/>
+          </w:tcPr>
+          <w:p>
+            <w:r>
+              <w:t>576/576</w:t>
+            </w:r>
+          </w:p>
+        </w:tc>
+        <w:tc>
+          <w:tcPr>
+            <w:tcW w:type="dxa" w:w="1440"/>
+          </w:tcPr>
+          <w:p>
+            <w:r>
+              <w:t>576</w:t>
+            </w:r>
+          </w:p>
+        </w:tc>
+        <w:tc>
+          <w:tcPr>
+            <w:tcW w:type="dxa" w:w="1440"/>
+          </w:tcPr>
+          <w:p>
+            <w:r>
+              <w:t>100</w:t>
+            </w:r>
+          </w:p>
+        </w:tc>
+        <w:tc>
+          <w:tcPr>
+            <w:tcW w:type="dxa" w:w="1440"/>
+          </w:tcPr>
+          <w:p>
+            <w:r/>
+          </w:p>
+        </w:tc>
+      </w:tr>
+      <w:tr>
+        <w:tc>
+          <w:tcPr>
+            <w:tcW w:type="dxa" w:w="1440"/>
+          </w:tcPr>
+          <w:p>
+            <w:r>
+              <w:t>G3-AOM-Mixed</w:t>
+            </w:r>
+          </w:p>
+        </w:tc>
+        <w:tc>
+          <w:tcPr>
+            <w:tcW w:type="dxa" w:w="1440"/>
+          </w:tcPr>
+          <w:p>
+            <w:r>
+              <w:t>AOM混合型: 4k BC&gt;0.5k BC（付与例）</w:t>
+            </w:r>
+          </w:p>
+        </w:tc>
+        <w:tc>
+          <w:tcPr>
+            <w:tcW w:type="dxa" w:w="1440"/>
+          </w:tcPr>
+          <w:p>
+            <w:r>
+              <w:t>361/361</w:t>
+            </w:r>
+          </w:p>
+        </w:tc>
+        <w:tc>
+          <w:tcPr>
+            <w:tcW w:type="dxa" w:w="1440"/>
+          </w:tcPr>
+          <w:p>
+            <w:r>
+              <w:t>361</w:t>
+            </w:r>
+          </w:p>
+        </w:tc>
+        <w:tc>
+          <w:tcPr>
+            <w:tcW w:type="dxa" w:w="1440"/>
+          </w:tcPr>
+          <w:p>
+            <w:r>
+              <w:t>100</w:t>
+            </w:r>
+          </w:p>
+        </w:tc>
+        <w:tc>
+          <w:tcPr>
+            <w:tcW w:type="dxa" w:w="1440"/>
+          </w:tcPr>
+          <w:p>
+            <w:r/>
+          </w:p>
+        </w:tc>
+      </w:tr>
+      <w:tr>
+        <w:tc>
+          <w:tcPr>
+            <w:tcW w:type="dxa" w:w="1440"/>
+          </w:tcPr>
+          <w:p>
+            <w:r>
+              <w:t>T1</w:t>
+            </w:r>
+          </w:p>
+        </w:tc>
+        <w:tc>
+          <w:tcPr>
+            <w:tcW w:type="dxa" w:w="1440"/>
+          </w:tcPr>
+          <w:p>
+            <w:r>
+              <w:t>年齢効果 SNHL_Age（70s−20s, 4–8k平均AC）</w:t>
+            </w:r>
+          </w:p>
+        </w:tc>
+        <w:tc>
+          <w:tcPr>
+            <w:tcW w:type="dxa" w:w="1440"/>
+          </w:tcPr>
+          <w:p>
+            <w:r>
+              <w:t>200/200</w:t>
+            </w:r>
+          </w:p>
+        </w:tc>
+        <w:tc>
+          <w:tcPr>
+            <w:tcW w:type="dxa" w:w="1440"/>
+          </w:tcPr>
+          <w:p>
+            <w:r>
+              <w:t>200</w:t>
+            </w:r>
+          </w:p>
+        </w:tc>
+        <w:tc>
+          <w:tcPr>
+            <w:tcW w:type="dxa" w:w="1440"/>
+          </w:tcPr>
+          <w:p>
+            <w:r>
+              <w:t>100</w:t>
+            </w:r>
+          </w:p>
+        </w:tc>
+        <w:tc>
+          <w:tcPr>
+            <w:tcW w:type="dxa" w:w="1440"/>
+          </w:tcPr>
+          <w:p>
+            <w:r>
+              <w:t>差の中央値 42.5 dB (IQR 37.5–47.5)</w:t>
+            </w:r>
+          </w:p>
+        </w:tc>
+      </w:tr>
+      <w:tr>
+        <w:tc>
+          <w:tcPr>
+            <w:tcW w:type="dxa" w:w="1440"/>
+          </w:tcPr>
+          <w:p>
+            <w:r>
+              <w:t>T8</w:t>
+            </w:r>
+          </w:p>
+        </w:tc>
+        <w:tc>
+          <w:tcPr>
+            <w:tcW w:type="dxa" w:w="1440"/>
+          </w:tcPr>
+          <w:p>
+            <w:r>
+              <w:t>程度の非減少（正常以外・同一seed・一側は患側固定）</w:t>
+            </w:r>
+          </w:p>
+        </w:tc>
+        <w:tc>
+          <w:tcPr>
+            <w:tcW w:type="dxa" w:w="1440"/>
+          </w:tcPr>
+          <w:p>
+            <w:r>
+              <w:t>540/540</w:t>
+            </w:r>
+          </w:p>
+        </w:tc>
+        <w:tc>
+          <w:tcPr>
+            <w:tcW w:type="dxa" w:w="1440"/>
+          </w:tcPr>
+          <w:p>
+            <w:r>
+              <w:t>540</w:t>
+            </w:r>
+          </w:p>
+        </w:tc>
+        <w:tc>
+          <w:tcPr>
+            <w:tcW w:type="dxa" w:w="1440"/>
+          </w:tcPr>
+          <w:p>
+            <w:r>
+              <w:t>100</w:t>
+            </w:r>
+          </w:p>
+        </w:tc>
+        <w:tc>
+          <w:tcPr>
+            <w:tcW w:type="dxa" w:w="1440"/>
+          </w:tcPr>
+          <w:p>
+            <w:r>
+              <w:t>SNHL_Age:60/60; SNHL_NoiseNotch:60/60; SNHL_Meniere:60/60; SNHL_Sudden:60/60; SNHL_Mumps:60/60; CHL_OME:60/60; CHL_AOM:6</w:t>
+            </w:r>
+          </w:p>
+        </w:tc>
+      </w:tr>
+      <w:tr>
+        <w:tc>
+          <w:tcPr>
+            <w:tcW w:type="dxa" w:w="1440"/>
+          </w:tcPr>
+          <w:p>
+            <w:r>
+              <w:t>T7</w:t>
+            </w:r>
+          </w:p>
+        </w:tc>
+        <w:tc>
+          <w:tcPr>
+            <w:tcW w:type="dxa" w:w="1440"/>
+          </w:tcPr>
+          <w:p>
+            <w:r>
+              <w:t>Sudden一側差≥30 dB（焦点: 程度2固定）</w:t>
+            </w:r>
+          </w:p>
+        </w:tc>
+        <w:tc>
+          <w:tcPr>
+            <w:tcW w:type="dxa" w:w="1440"/>
+          </w:tcPr>
+          <w:p>
+            <w:r>
+              <w:t>200/200</w:t>
+            </w:r>
+          </w:p>
+        </w:tc>
+        <w:tc>
+          <w:tcPr>
+            <w:tcW w:type="dxa" w:w="1440"/>
+          </w:tcPr>
+          <w:p>
+            <w:r>
+              <w:t>200</w:t>
+            </w:r>
+          </w:p>
+        </w:tc>
+        <w:tc>
+          <w:tcPr>
+            <w:tcW w:type="dxa" w:w="1440"/>
+          </w:tcPr>
+          <w:p>
+            <w:r>
+              <w:t>100</w:t>
+            </w:r>
+          </w:p>
+        </w:tc>
+        <w:tc>
+          <w:tcPr>
+            <w:tcW w:type="dxa" w:w="1440"/>
+          </w:tcPr>
+          <w:p>
+            <w:r>
+              <w:t>焦点差中央値 51.7 dB（グリッドの程度≥1規則と同じ30 dB床）</w:t>
+            </w:r>
+          </w:p>
+        </w:tc>
+      </w:tr>
+      <w:tr>
+        <w:tc>
+          <w:tcPr>
+            <w:tcW w:type="dxa" w:w="1440"/>
+          </w:tcPr>
+          <w:p>
+            <w:r>
+              <w:t>T6a</w:t>
+            </w:r>
+          </w:p>
+        </w:tc>
+        <w:tc>
+          <w:tcPr>
+            <w:tcW w:type="dxa" w:w="1440"/>
+          </w:tcPr>
+          <w:p>
+            <w:r>
+              <w:t>Carhart様・付与の有無（期待80%）</w:t>
+            </w:r>
+          </w:p>
+        </w:tc>
+        <w:tc>
+          <w:tcPr>
+            <w:tcW w:type="dxa" w:w="1440"/>
+          </w:tcPr>
+          <w:p>
+            <w:r>
+              <w:t>160/200</w:t>
+            </w:r>
+          </w:p>
+        </w:tc>
+        <w:tc>
+          <w:tcPr>
+            <w:tcW w:type="dxa" w:w="1440"/>
+          </w:tcPr>
+          <w:p>
+            <w:r>
+              <w:t>200</w:t>
+            </w:r>
+          </w:p>
+        </w:tc>
+        <w:tc>
+          <w:tcPr>
+            <w:tcW w:type="dxa" w:w="1440"/>
+          </w:tcPr>
+          <w:p>
+            <w:r>
+              <w:t>80</w:t>
+            </w:r>
+          </w:p>
+        </w:tc>
+        <w:tc>
+          <w:tcPr>
+            <w:tcW w:type="dxa" w:w="1440"/>
+          </w:tcPr>
+          <w:p>
+            <w:r>
+              <w:t>同じ200件での付与 160/200=80.0% (95%CI 73.9–85.0%)。許容帯70–90%は凍結正解表で事前設定。95%CIはWilson法。帯内のため試験合格</w:t>
+            </w:r>
+          </w:p>
+        </w:tc>
+      </w:tr>
+      <w:tr>
+        <w:tc>
+          <w:tcPr>
+            <w:tcW w:type="dxa" w:w="1440"/>
+          </w:tcPr>
+          <w:p>
+            <w:r>
+              <w:t>T6b</w:t>
+            </w:r>
+          </w:p>
+        </w:tc>
+        <w:tc>
+          <w:tcPr>
+            <w:tcW w:type="dxa" w:w="1440"/>
+          </w:tcPr>
+          <w:p>
+            <w:r>
+              <w:t>Carhart様・付与例の形（T6aと同じ200件）</w:t>
+            </w:r>
+          </w:p>
+        </w:tc>
+        <w:tc>
+          <w:tcPr>
+            <w:tcW w:type="dxa" w:w="1440"/>
+          </w:tcPr>
+          <w:p>
+            <w:r>
+              <w:t>160/160</w:t>
+            </w:r>
+          </w:p>
+        </w:tc>
+        <w:tc>
+          <w:tcPr>
+            <w:tcW w:type="dxa" w:w="1440"/>
+          </w:tcPr>
+          <w:p>
+            <w:r>
+              <w:t>160</w:t>
+            </w:r>
+          </w:p>
+        </w:tc>
+        <w:tc>
+          <w:tcPr>
+            <w:tcW w:type="dxa" w:w="1440"/>
+          </w:tcPr>
+          <w:p>
+            <w:r>
+              <w:t>100</w:t>
+            </w:r>
+          </w:p>
+        </w:tc>
+        <w:tc>
+          <w:tcPr>
+            <w:tcW w:type="dxa" w:w="1440"/>
+          </w:tcPr>
+          <w:p>
+            <w:r>
+              <w:t>T6aで付与された160件の形（160/160）</w:t>
+            </w:r>
+          </w:p>
+        </w:tc>
+      </w:tr>
+      <w:tr>
+        <w:tc>
+          <w:tcPr>
+            <w:tcW w:type="dxa" w:w="1440"/>
+          </w:tcPr>
+          <w:p>
+            <w:r>
+              <w:t>T6c</w:t>
+            </w:r>
+          </w:p>
+        </w:tc>
+        <w:tc>
+          <w:tcPr>
+            <w:tcW w:type="dxa" w:w="1440"/>
+          </w:tcPr>
+          <w:p>
+            <w:r>
+              <w:t>AOM混合型・付与の有無（教育用50%）</w:t>
+            </w:r>
+          </w:p>
+        </w:tc>
+        <w:tc>
+          <w:tcPr>
+            <w:tcW w:type="dxa" w:w="1440"/>
+          </w:tcPr>
+          <w:p>
+            <w:r>
+              <w:t>101/200</w:t>
+            </w:r>
+          </w:p>
+        </w:tc>
+        <w:tc>
+          <w:tcPr>
+            <w:tcW w:type="dxa" w:w="1440"/>
+          </w:tcPr>
+          <w:p>
+            <w:r>
+              <w:t>200</w:t>
+            </w:r>
+          </w:p>
+        </w:tc>
+        <w:tc>
+          <w:tcPr>
+            <w:tcW w:type="dxa" w:w="1440"/>
+          </w:tcPr>
+          <w:p>
+            <w:r>
+              <w:t>50.5</w:t>
+            </w:r>
+          </w:p>
+        </w:tc>
+        <w:tc>
+          <w:tcPr>
+            <w:tcW w:type="dxa" w:w="1440"/>
+          </w:tcPr>
+          <w:p>
+            <w:r>
+              <w:t>同じ200件での付与 101/200=50.5% (95%CI 43.6–57.4%)。許容帯40–60%は凍結正解表で事前設定。95%CIはWilson法。帯内のため試験合格。臨床発生率ではない</w:t>
+            </w:r>
+          </w:p>
+        </w:tc>
+      </w:tr>
+      <w:tr>
+        <w:tc>
+          <w:tcPr>
+            <w:tcW w:type="dxa" w:w="1440"/>
+          </w:tcPr>
+          <w:p>
+            <w:r>
+              <w:t>T6d</w:t>
+            </w:r>
+          </w:p>
+        </w:tc>
+        <w:tc>
+          <w:tcPr>
+            <w:tcW w:type="dxa" w:w="1440"/>
+          </w:tcPr>
+          <w:p>
+            <w:r>
+              <w:t>AOM混合型・付与例の形（T6cと同じ200件）</w:t>
+            </w:r>
+          </w:p>
+        </w:tc>
+        <w:tc>
+          <w:tcPr>
+            <w:tcW w:type="dxa" w:w="1440"/>
+          </w:tcPr>
+          <w:p>
+            <w:r>
+              <w:t>101/101</w:t>
+            </w:r>
+          </w:p>
+        </w:tc>
+        <w:tc>
+          <w:tcPr>
+            <w:tcW w:type="dxa" w:w="1440"/>
+          </w:tcPr>
+          <w:p>
+            <w:r>
+              <w:t>101</w:t>
+            </w:r>
+          </w:p>
+        </w:tc>
+        <w:tc>
+          <w:tcPr>
+            <w:tcW w:type="dxa" w:w="1440"/>
+          </w:tcPr>
+          <w:p>
+            <w:r>
+              <w:t>100</w:t>
+            </w:r>
+          </w:p>
+        </w:tc>
+        <w:tc>
+          <w:tcPr>
+            <w:tcW w:type="dxa" w:w="1440"/>
+          </w:tcPr>
+          <w:p>
+            <w:r>
+              <w:t>T6cで付与された101件の形（101/101）</w:t>
+            </w:r>
+          </w:p>
+        </w:tc>
+      </w:tr>
+      <w:tr>
+        <w:tc>
+          <w:tcPr>
+            <w:tcW w:type="dxa" w:w="1440"/>
+          </w:tcPr>
+          <w:p>
+            <w:r>
+              <w:t>T10</w:t>
+            </w:r>
+          </w:p>
+        </w:tc>
+        <w:tc>
+          <w:tcPr>
+            <w:tcW w:type="dxa" w:w="1440"/>
+          </w:tcPr>
+          <w:p>
+            <w:r>
+              <w:t>seed固定の決定論的再現（不一致0を目標）</w:t>
+            </w:r>
+          </w:p>
+        </w:tc>
+        <w:tc>
+          <w:tcPr>
+            <w:tcW w:type="dxa" w:w="1440"/>
+          </w:tcPr>
+          <w:p>
+            <w:r>
+              <w:t>200/200</w:t>
+            </w:r>
+          </w:p>
+        </w:tc>
+        <w:tc>
+          <w:tcPr>
+            <w:tcW w:type="dxa" w:w="1440"/>
+          </w:tcPr>
+          <w:p>
+            <w:r>
+              <w:t>200</w:t>
+            </w:r>
+          </w:p>
+        </w:tc>
+        <w:tc>
+          <w:tcPr>
+            <w:tcW w:type="dxa" w:w="1440"/>
+          </w:tcPr>
+          <w:p>
+            <w:r>
+              <w:t>100</w:t>
+            </w:r>
+          </w:p>
+        </w:tc>
+        <w:tc>
+          <w:tcPr>
+            <w:tcW w:type="dxa" w:w="1440"/>
+          </w:tcPr>
+          <w:p>
+            <w:r>
+              <w:t>不一致 0</w:t>
+            </w:r>
+          </w:p>
+        </w:tc>
+      </w:tr>
+      <w:tr>
+        <w:tc>
+          <w:tcPr>
+            <w:tcW w:type="dxa" w:w="1440"/>
+          </w:tcPr>
+          <w:p>
+            <w:r>
+              <w:t>T11</w:t>
+            </w:r>
+          </w:p>
+        </w:tc>
+        <w:tc>
+          <w:tcPr>
+            <w:tcW w:type="dxa" w:w="1440"/>
+          </w:tcPr>
+          <w:p>
+            <w:r>
+              <w:t>同一条件・異seedの出力多様性（記述・合否基準なし）</w:t>
+            </w:r>
+          </w:p>
+        </w:tc>
+        <w:tc>
+          <w:tcPr>
+            <w:tcW w:type="dxa" w:w="1440"/>
+          </w:tcPr>
+          <w:p>
+            <w:r>
+              <w:t>—</w:t>
+            </w:r>
+          </w:p>
+        </w:tc>
+        <w:tc>
+          <w:tcPr>
+            <w:tcW w:type="dxa" w:w="1440"/>
+          </w:tcPr>
+          <w:p>
+            <w:r>
+              <w:t>—</w:t>
+            </w:r>
+          </w:p>
+        </w:tc>
+        <w:tc>
+          <w:tcPr>
+            <w:tcW w:type="dxa" w:w="1440"/>
+          </w:tcPr>
+          <w:p>
+            <w:r>
+              <w:t>—</w:t>
+            </w:r>
+          </w:p>
+        </w:tc>
+        <w:tc>
+          <w:tcPr>
+            <w:tcW w:type="dxa" w:w="1440"/>
+          </w:tcPr>
+          <w:p>
+            <w:r>
+              <w:t>記述。合否基準なし。全件不一致は非要求。条件表は下表。</w:t>
+            </w:r>
+          </w:p>
+        </w:tc>
+      </w:tr>
+    </w:tbl>
+    <w:p/>
+    <w:p>
+      <w:pPr>
+        <w:pStyle w:val="Heading3"/>
+      </w:pPr>
+      <w:r>
+        <w:t>T11の実行条件（乱数初期値のみ変更）</w:t>
       </w:r>
     </w:p>
     <w:p>
       <w:r>
-        <w:t>- 伝音ABG 滲出性中耳炎: n=4800, 中央値15.0dB (IQR 10.0–20.0, 範囲 -5.0–40.0)</w:t>
+        <w:t>年齢・性別・疾患パターン・難聴程度を固定し、乱数初期値のみを変えて各200件を生成した。左右の気導・骨導が一組として完全に一致する場合を同一の閾値セットと数えた。全件不一致は合格条件ではない（5 dB丸めにより偶然一致しうる）。観測では各条件とも200通りであった。</w:t>
       </w:r>
     </w:p>
     <w:p>
       <w:r>
-        <w:t>- 伝音ABG 急性中耳炎・伝音型: n=2995, 中央値15.0dB (IQR 10.0–20.0, 範囲 -5.0–40.0)</w:t>
+        <w:t>乱数初期値は各条件の基準値に0〜199を加えた連番である（条件1：80000＋i、条件2：81000＋i、条件3：82000＋i）。</w:t>
+      </w:r>
+    </w:p>
+    <w:tbl>
+      <w:tblPr>
+        <w:tblStyle w:val="TableGrid"/>
+        <w:tblW w:type="auto" w:w="0"/>
+        <w:tblLook w:firstColumn="1" w:firstRow="1" w:lastColumn="0" w:lastRow="0" w:noHBand="0" w:noVBand="1" w:val="04A0"/>
+      </w:tblPr>
+      <w:tblGrid>
+        <w:gridCol w:w="1080"/>
+        <w:gridCol w:w="1080"/>
+        <w:gridCol w:w="1080"/>
+        <w:gridCol w:w="1080"/>
+        <w:gridCol w:w="1080"/>
+        <w:gridCol w:w="1080"/>
+        <w:gridCol w:w="1080"/>
+        <w:gridCol w:w="1080"/>
+      </w:tblGrid>
+      <w:tr>
+        <w:tc>
+          <w:tcPr>
+            <w:tcW w:type="dxa" w:w="1080"/>
+          </w:tcPr>
+          <w:p>
+            <w:r>
+              <w:t>条件</w:t>
+            </w:r>
+          </w:p>
+        </w:tc>
+        <w:tc>
+          <w:tcPr>
+            <w:tcW w:type="dxa" w:w="1080"/>
+          </w:tcPr>
+          <w:p>
+            <w:r>
+              <w:t>年齢群</w:t>
+            </w:r>
+          </w:p>
+        </w:tc>
+        <w:tc>
+          <w:tcPr>
+            <w:tcW w:type="dxa" w:w="1080"/>
+          </w:tcPr>
+          <w:p>
+            <w:r>
+              <w:t>性別</w:t>
+            </w:r>
+          </w:p>
+        </w:tc>
+        <w:tc>
+          <w:tcPr>
+            <w:tcW w:type="dxa" w:w="1080"/>
+          </w:tcPr>
+          <w:p>
+            <w:r>
+              <w:t>疾患パターン</w:t>
+            </w:r>
+          </w:p>
+        </w:tc>
+        <w:tc>
+          <w:tcPr>
+            <w:tcW w:type="dxa" w:w="1080"/>
+          </w:tcPr>
+          <w:p>
+            <w:r>
+              <w:t>程度</w:t>
+            </w:r>
+          </w:p>
+        </w:tc>
+        <w:tc>
+          <w:tcPr>
+            <w:tcW w:type="dxa" w:w="1080"/>
+          </w:tcPr>
+          <w:p>
+            <w:r>
+              <w:t>生成数</w:t>
+            </w:r>
+          </w:p>
+        </w:tc>
+        <w:tc>
+          <w:tcPr>
+            <w:tcW w:type="dxa" w:w="1080"/>
+          </w:tcPr>
+          <w:p>
+            <w:r>
+              <w:t>異なる閾値セット数</w:t>
+            </w:r>
+          </w:p>
+        </w:tc>
+        <w:tc>
+          <w:tcPr>
+            <w:tcW w:type="dxa" w:w="1080"/>
+          </w:tcPr>
+          <w:p>
+            <w:r>
+              <w:t>乱数初期値</w:t>
+            </w:r>
+          </w:p>
+        </w:tc>
+      </w:tr>
+      <w:tr>
+        <w:tc>
+          <w:tcPr>
+            <w:tcW w:type="dxa" w:w="1080"/>
+          </w:tcPr>
+          <w:p>
+            <w:r>
+              <w:t>1</w:t>
+            </w:r>
+          </w:p>
+        </w:tc>
+        <w:tc>
+          <w:tcPr>
+            <w:tcW w:type="dxa" w:w="1080"/>
+          </w:tcPr>
+          <w:p>
+            <w:r>
+              <w:t>50歳代</w:t>
+            </w:r>
+          </w:p>
+        </w:tc>
+        <w:tc>
+          <w:tcPr>
+            <w:tcW w:type="dxa" w:w="1080"/>
+          </w:tcPr>
+          <w:p>
+            <w:r>
+              <w:t>男性</w:t>
+            </w:r>
+          </w:p>
+        </w:tc>
+        <w:tc>
+          <w:tcPr>
+            <w:tcW w:type="dxa" w:w="1080"/>
+          </w:tcPr>
+          <w:p>
+            <w:r>
+              <w:t>騒音性難聴</w:t>
+            </w:r>
+          </w:p>
+        </w:tc>
+        <w:tc>
+          <w:tcPr>
+            <w:tcW w:type="dxa" w:w="1080"/>
+          </w:tcPr>
+          <w:p>
+            <w:r>
+              <w:t>中等度</w:t>
+            </w:r>
+          </w:p>
+        </w:tc>
+        <w:tc>
+          <w:tcPr>
+            <w:tcW w:type="dxa" w:w="1080"/>
+          </w:tcPr>
+          <w:p>
+            <w:r>
+              <w:t>200</w:t>
+            </w:r>
+          </w:p>
+        </w:tc>
+        <w:tc>
+          <w:tcPr>
+            <w:tcW w:type="dxa" w:w="1080"/>
+          </w:tcPr>
+          <w:p>
+            <w:r>
+              <w:t>200</w:t>
+            </w:r>
+          </w:p>
+        </w:tc>
+        <w:tc>
+          <w:tcPr>
+            <w:tcW w:type="dxa" w:w="1080"/>
+          </w:tcPr>
+          <w:p>
+            <w:r>
+              <w:t>80000–80199</w:t>
+            </w:r>
+          </w:p>
+        </w:tc>
+      </w:tr>
+      <w:tr>
+        <w:tc>
+          <w:tcPr>
+            <w:tcW w:type="dxa" w:w="1080"/>
+          </w:tcPr>
+          <w:p>
+            <w:r>
+              <w:t>2</w:t>
+            </w:r>
+          </w:p>
+        </w:tc>
+        <w:tc>
+          <w:tcPr>
+            <w:tcW w:type="dxa" w:w="1080"/>
+          </w:tcPr>
+          <w:p>
+            <w:r>
+              <w:t>40歳代</w:t>
+            </w:r>
+          </w:p>
+        </w:tc>
+        <w:tc>
+          <w:tcPr>
+            <w:tcW w:type="dxa" w:w="1080"/>
+          </w:tcPr>
+          <w:p>
+            <w:r>
+              <w:t>女性</w:t>
+            </w:r>
+          </w:p>
+        </w:tc>
+        <w:tc>
+          <w:tcPr>
+            <w:tcW w:type="dxa" w:w="1080"/>
+          </w:tcPr>
+          <w:p>
+            <w:r>
+              <w:t>滲出性中耳炎</w:t>
+            </w:r>
+          </w:p>
+        </w:tc>
+        <w:tc>
+          <w:tcPr>
+            <w:tcW w:type="dxa" w:w="1080"/>
+          </w:tcPr>
+          <w:p>
+            <w:r>
+              <w:t>中等度</w:t>
+            </w:r>
+          </w:p>
+        </w:tc>
+        <w:tc>
+          <w:tcPr>
+            <w:tcW w:type="dxa" w:w="1080"/>
+          </w:tcPr>
+          <w:p>
+            <w:r>
+              <w:t>200</w:t>
+            </w:r>
+          </w:p>
+        </w:tc>
+        <w:tc>
+          <w:tcPr>
+            <w:tcW w:type="dxa" w:w="1080"/>
+          </w:tcPr>
+          <w:p>
+            <w:r>
+              <w:t>200</w:t>
+            </w:r>
+          </w:p>
+        </w:tc>
+        <w:tc>
+          <w:tcPr>
+            <w:tcW w:type="dxa" w:w="1080"/>
+          </w:tcPr>
+          <w:p>
+            <w:r>
+              <w:t>81000–81199</w:t>
+            </w:r>
+          </w:p>
+        </w:tc>
+      </w:tr>
+      <w:tr>
+        <w:tc>
+          <w:tcPr>
+            <w:tcW w:type="dxa" w:w="1080"/>
+          </w:tcPr>
+          <w:p>
+            <w:r>
+              <w:t>3</w:t>
+            </w:r>
+          </w:p>
+        </w:tc>
+        <w:tc>
+          <w:tcPr>
+            <w:tcW w:type="dxa" w:w="1080"/>
+          </w:tcPr>
+          <w:p>
+            <w:r>
+              <w:t>40歳代</w:t>
+            </w:r>
+          </w:p>
+        </w:tc>
+        <w:tc>
+          <w:tcPr>
+            <w:tcW w:type="dxa" w:w="1080"/>
+          </w:tcPr>
+          <w:p>
+            <w:r>
+              <w:t>男性</w:t>
+            </w:r>
+          </w:p>
+        </w:tc>
+        <w:tc>
+          <w:tcPr>
+            <w:tcW w:type="dxa" w:w="1080"/>
+          </w:tcPr>
+          <w:p>
+            <w:r>
+              <w:t>正常</w:t>
+            </w:r>
+          </w:p>
+        </w:tc>
+        <w:tc>
+          <w:tcPr>
+            <w:tcW w:type="dxa" w:w="1080"/>
+          </w:tcPr>
+          <w:p>
+            <w:r>
+              <w:t>なし</w:t>
+            </w:r>
+          </w:p>
+        </w:tc>
+        <w:tc>
+          <w:tcPr>
+            <w:tcW w:type="dxa" w:w="1080"/>
+          </w:tcPr>
+          <w:p>
+            <w:r>
+              <w:t>200</w:t>
+            </w:r>
+          </w:p>
+        </w:tc>
+        <w:tc>
+          <w:tcPr>
+            <w:tcW w:type="dxa" w:w="1080"/>
+          </w:tcPr>
+          <w:p>
+            <w:r>
+              <w:t>200</w:t>
+            </w:r>
+          </w:p>
+        </w:tc>
+        <w:tc>
+          <w:tcPr>
+            <w:tcW w:type="dxa" w:w="1080"/>
+          </w:tcPr>
+          <w:p>
+            <w:r>
+              <w:t>82000–82199</w:t>
+            </w:r>
+          </w:p>
+        </w:tc>
+      </w:tr>
+    </w:tbl>
+    <w:p>
+      <w:pPr>
+        <w:pStyle w:val="Heading2"/>
+      </w:pPr>
+      <w:r>
+        <w:t>3．検証・記述統計指標の定義</w:t>
       </w:r>
     </w:p>
     <w:p>
       <w:r>
-        <w:t>- 伝音ABG 急性中耳炎・混合型: n=1805, 中央値15.0dB (IQR 10.0–20.0, 範囲 0.0–40.0)</w:t>
+        <w:t>・一側差（突発性難聴・ムンプス難聴）：病側と対側の気導閾値の差。0.5、1、2 kHzの単純平均気導で算出した。</w:t>
       </w:r>
     </w:p>
     <w:p>
       <w:r>
-        <w:t>- 伝音ABG 耳硬化症: n=4800, 中央値15.0dB (IQR 5.0–20.0, 範囲 -5.0–40.0)</w:t>
+        <w:t>・突発性難聴の左右差規則（程度≥1）：上記一側差が30 dB以上。</w:t>
       </w:r>
     </w:p>
     <w:p>
       <w:r>
-        <w:t>- 伝音ABG 耳小骨連鎖離断パターン: n=4800, 中央値30.0dB (IQR 25.0–40.0, 範囲 15.0–50.0)</w:t>
+        <w:t>・ムンプス難聴の高度床（程度≥1）：病側平均気導≥70 dBかつ一側差≥55 dB。学習者向け無作為選択では軽度を選ばないが、検証グリッドでは程度1も明示指定で生成し、深度は中等度相当として高度床を満たす。</w:t>
       </w:r>
     </w:p>
     <w:p>
       <w:r>
-        <w:t>- C5-dipの深さ（4k−2k AC, 程度≥1）: n=720, 中央値25.0dB (IQR 20.0–30.0, 範囲 10.0–65.0)</w:t>
+        <w:t>・加齢効果（T1）：70歳代と20歳代の4、8 kHz気導の単純平均の差。</w:t>
       </w:r>
     </w:p>
     <w:p>
       <w:r>
-        <w:t>- AOM混合型（程度≥1）: 361/720 (50.1%)。付与例の4k BC&gt;0.5k BCは 361/361</w:t>
+        <w:t>・C5-dipの深さ：4 kHz−2 kHzおよび4 kHz−8 kHz（気導、程度≥1）。規則は双方に10 dB床を課す。</w:t>
       </w:r>
     </w:p>
     <w:p>
       <w:r>
-        <w:t>- Carhart様の深さ（BC2−mean(BC1,BC4), 発現例）: n=576, 中央値7.5dB (IQR 7.5–12.5, 範囲 5.0–22.5)</w:t>
+        <w:t>・Carhart様の深さ：BC 2 kHz − mean(BC 1 kHz, BC 4 kHz)（付与例）。深さ床は5 dB（識別可能な最小切痕としての著者設定）。</w:t>
       </w:r>
     </w:p>
     <w:p>
       <w:r>
-        <w:t>- 一側差 Sudden（程度≥1 全体）: n=720, 中央値51.7dB (IQR 40.0–70.0, 範囲 30.0–108.3)</w:t>
+        <w:t>・伝音ABG：病側・骨導測定周波数（0.25–4 kHz）ごとの気導−骨導。記述統計の集計には規則の対象外周波数も含む。対象外周波数では教育用に骨導≤気導＋5 dBを許容するため、ABGとして−5 dBが観測されうる。</w:t>
       </w:r>
     </w:p>
     <w:p>
       <w:r>
-        <w:t>- 一側差 Sudden 程度1: n=240, 中央値36.7dB (IQR 33.3–40.0, 範囲 30.0–41.7)</w:t>
-      </w:r>
-    </w:p>
-    <w:p>
-      <w:r>
-        <w:t>- 一側差 Sudden 程度2: n=240, 中央値51.7dB (IQR 48.3–55.0, 範囲 36.7–56.7)</w:t>
-      </w:r>
-    </w:p>
-    <w:p>
-      <w:r>
-        <w:t>- 一側差 Sudden 程度3: n=240, 中央値73.3dB (IQR 70.0–75.0, 範囲 56.7–108.3)</w:t>
-      </w:r>
-    </w:p>
-    <w:p>
-      <w:r>
-        <w:t>- 一側差 Mumps（程度≥1）: n=720, 中央値95.0dB (IQR 86.7–106.7, 範囲 78.3–108.3)</w:t>
-      </w:r>
-    </w:p>
-    <w:p>
-      <w:r>
-        <w:t>- Sudden SO（程度≥1）: none 555, hf 139, full 26 / 程度別 sev1={"none":240,"hf":0,"full":0} sev2={"none":189,"hf":51,"full":0} sev3={"none":126,"hf":88,"full":26}</w:t>
-      </w:r>
-    </w:p>
-    <w:p>
-      <w:r>
-        <w:t>- Mumps 全周SO（程度≥1）: 354/720 (49.2%)</w:t>
-      </w:r>
-    </w:p>
-    <w:p>
-      <w:r>
-        <w:t>- 注: T7焦点は程度2・固定条件の200件。グリッドの程度≥1（720件）と同じ30 dB一側差床。SO点の数値処理は電子付録の指標定義を参照。</w:t>
-      </w:r>
-    </w:p>
-    <w:p>
-      <w:r>
-        <w:t>- Carhart様: Bernoulli（rand()&lt;0.8）。決定論的80%割付ではない。グリッド発現 576/720、T6a観測160/200。</w:t>
-      </w:r>
-    </w:p>
-    <w:p>
-      <w:r>
-        <w:t>- T8内訳: 正常以外9プロファイル × 6年齢 × 2性別 × 5 seed = 540セル</w:t>
-      </w:r>
-    </w:p>
-    <w:p>
-      <w:r>
-        <w:t>- T6a/T6b: 同じ200件。T6aは付与の有無（160/200）、T6bはその付与例の形（160/160）。</w:t>
-      </w:r>
-    </w:p>
-    <w:p>
-      <w:r>
-        <w:t>- T6c/T6d: 同じ200件。T6cは付与の有無（101/200）、T6dはその付与例の形（101/101）。</w:t>
-      </w:r>
-    </w:p>
-    <w:p>
-      <w:r>
-        <w:t>- T11: 同一条件でseedのみ変えた200件のユニーク出力数（5 dB丸めのため全件不一致は要求しない）。</w:t>
+        <w:t>・スケールアウト（SO）：当該周波数の教育用気導上限値を数値として保持しSOフラグを付す。上限＋5 dB等の外挿代入は行わない。一側差・平均の算出はこの数値を用いる。</w:t>
       </w:r>
     </w:p>
     <w:p>
@@ -311,27 +2517,102 @@
         <w:pStyle w:val="Heading2"/>
       </w:pPr>
       <w:r>
-        <w:t>指標定義（SOの数値処理）</w:t>
+        <w:t>4．記述統計（グリッド由来）</w:t>
       </w:r>
     </w:p>
     <w:p>
       <w:r>
-        <w:t>- スケールアウト（SO）点は、当該周波数の教育用気導上限値（LIMITS_AC.max）を数値として保持し、`soAC=true`（骨導SO時は周波数別NR閾値と`soBC=true`）を付す。上限＋5 dB等の外挿代入は行わない。</w:t>
+        <w:t>・伝音ABG（病側・骨導周波数・一括）：n=19200、中央値15.0 dB（四分位範囲10.0–25.0、範囲-5.0–50.0）。※規則の対象外周波数も含むため最小値に−5 dBが観測された。規則指定周波数では所定の最小ABGを満たした。</w:t>
       </w:r>
     </w:p>
     <w:p>
       <w:r>
-        <w:t>- 一側差・病側平均（0.5/1/2 kHz）の算出では、上記の数値（上限値）を含め、3周波がすべて有限である場合のみ平均する。いずれかが非数なら当該例は判定不能（主合否では不適合扱い）。</w:t>
+        <w:t>・伝音ABG・滲出性中耳炎：n=4800、中央値15.0 dB（四分位範囲10.0–20.0、範囲-5.0–40.0）</w:t>
       </w:r>
     </w:p>
     <w:p>
       <w:r>
-        <w:t>- したがって G3-SuddenLat / G3-MumpsFloor の分母720は、SO例を除外せず、SO点を上限値代入したうえで床規則を評価した結果である。</w:t>
+        <w:t>・伝音ABG・急性中耳炎・伝音型：n=2995、中央値15.0 dB（四分位範囲10.0–20.0、範囲-5.0–40.0）</w:t>
       </w:r>
     </w:p>
     <w:p>
       <w:r>
-        <w:t>実行: Node v22.20.0 / darwin / audioscope-edu@1.0.0</w:t>
+        <w:t>・伝音ABG・急性中耳炎・混合型：n=1805、中央値15.0 dB（四分位範囲10.0–20.0、範囲0.0–40.0）</w:t>
+      </w:r>
+    </w:p>
+    <w:p>
+      <w:r>
+        <w:t>・伝音ABG・耳硬化症：n=4800、中央値15.0 dB（四分位範囲5.0–20.0、範囲-5.0–40.0）</w:t>
+      </w:r>
+    </w:p>
+    <w:p>
+      <w:r>
+        <w:t>・伝音ABG・耳小骨連鎖離断パターン：n=4800、中央値30.0 dB（四分位範囲25.0–40.0、範囲15.0–50.0）</w:t>
+      </w:r>
+    </w:p>
+    <w:p>
+      <w:r>
+        <w:t>・C5-dipの深さ（4 kHz−2 kHz気導、程度≥1）：n=720、中央値25.0 dB（四分位範囲20.0–30.0、範囲10.0–65.0）</w:t>
+      </w:r>
+    </w:p>
+    <w:p>
+      <w:r>
+        <w:t>・C5-dipの深さ（4 kHz−8 kHz気導、程度≥1）：n=720、中央値15.0 dB（四分位範囲10.0–20.0、範囲10.0–45.0）</w:t>
+      </w:r>
+    </w:p>
+    <w:p>
+      <w:r>
+        <w:t>・C5-dipの深さ（min(4k−2k, 4k−8k)、程度≥1）：n=720、中央値15.0 dB（四分位範囲10.0–20.0、範囲10.0–35.0）</w:t>
+      </w:r>
+    </w:p>
+    <w:p>
+      <w:r>
+        <w:t>・Carhart様の深さ（付与例）：n=576、中央値7.5 dB（四分位範囲7.5–12.5、範囲5.0–22.5）</w:t>
+      </w:r>
+    </w:p>
+    <w:p>
+      <w:r>
+        <w:t>・一側差 Sudden（程度≥1全体）：n=720、中央値51.7 dB（四分位範囲40.0–70.0、範囲30.0–108.3）</w:t>
+      </w:r>
+    </w:p>
+    <w:p>
+      <w:r>
+        <w:t>・一側差 Sudden 程度1／2／3：中央値36.7／51.7／73.3 dB（各n=240）。程度≥1は全例≥30 dB。</w:t>
+      </w:r>
+    </w:p>
+    <w:p>
+      <w:r>
+        <w:t>・一側差 Mumps（程度≥1全体）：n=720、中央値95.0 dB（四分位範囲86.7–106.7、範囲78.3–108.3）</w:t>
+      </w:r>
+    </w:p>
+    <w:p>
+      <w:r>
+        <w:t>・一側差 Mumps 程度1／2／3：中央値89.2／90.0／96.7 dB（各n=240）。程度次元は高度床によりほぼ縮退している。</w:t>
+      </w:r>
+    </w:p>
+    <w:p>
+      <w:r>
+        <w:t>・Sudden SO（程度≥1）：なし555件、高音域のみ139件、全周26件。程度2では高音域のみ51件・全周0件、程度3では高音域のみ88件・全周26件。</w:t>
+      </w:r>
+    </w:p>
+    <w:p>
+      <w:r>
+        <w:t>・Mumps 全周SO（程度≥1）：354/720（49.2%）</w:t>
+      </w:r>
+    </w:p>
+    <w:p>
+      <w:r>
+        <w:t>・床規則の別掲（全周SOを除く）：突発一側差 694/694、突発程度3 214/214、ムンプス 366/366、ムンプス（0.5/1/2 kHzにSOなし） 366/366。主合否の720/720はSOを含めた評価である。</w:t>
+      </w:r>
+    </w:p>
+    <w:p>
+      <w:r>
+        <w:t>・Carhart様変化：グリッド576/720（80.0%）。T6a/T6bは同じ200件（中等度）。</w:t>
+      </w:r>
+    </w:p>
+    <w:p>
+      <w:r>
+        <w:t>・AOM混合型：グリッド361/720（50.1%）。T6c/T6dは同じ200件（中等度）。</w:t>
       </w:r>
     </w:p>
     <w:p>
@@ -339,37 +2620,669 @@
         <w:pStyle w:val="Heading2"/>
       </w:pPr>
       <w:r>
-        <w:t>付録追記1．主な出力規則（本文との対応）</w:t>
+        <w:t>5．異常系テスト（意図的異常挿入）</w:t>
       </w:r>
     </w:p>
     <w:p>
       <w:r>
-        <w:t>- C5-dip（騒音、程度≥1）: 4 kHzが2 kHzおよび8 kHzよりそれぞれ **10 dB以上**（Colesらを参考にした著者設定。Coles基準そのものではない）。</w:t>
+        <w:t>正常・適合データ13項目と規則違反データ18項目の計31項目。規則違反18件はすべて不適合と判定された。生成プログラム本体の改変ではなく、正常生成結果または合成閾値に意図的変更を加えて検証スクリプトへ入力した。</w:t>
       </w:r>
     </w:p>
+    <w:tbl>
+      <w:tblPr>
+        <w:tblStyle w:val="TableGrid"/>
+        <w:tblW w:type="auto" w:w="0"/>
+        <w:tblLook w:firstColumn="1" w:firstRow="1" w:lastColumn="0" w:lastRow="0" w:noHBand="0" w:noVBand="1" w:val="04A0"/>
+      </w:tblPr>
+      <w:tblGrid>
+        <w:gridCol w:w="2880"/>
+        <w:gridCol w:w="2880"/>
+        <w:gridCol w:w="2880"/>
+      </w:tblGrid>
+      <w:tr>
+        <w:tc>
+          <w:tcPr>
+            <w:tcW w:type="dxa" w:w="2880"/>
+          </w:tcPr>
+          <w:p>
+            <w:r>
+              <w:t>ID</w:t>
+            </w:r>
+          </w:p>
+        </w:tc>
+        <w:tc>
+          <w:tcPr>
+            <w:tcW w:type="dxa" w:w="2880"/>
+          </w:tcPr>
+          <w:p>
+            <w:r>
+              <w:t>意図的な異常</w:t>
+            </w:r>
+          </w:p>
+        </w:tc>
+        <w:tc>
+          <w:tcPr>
+            <w:tcW w:type="dxa" w:w="2880"/>
+          </w:tcPr>
+          <w:p>
+            <w:r>
+              <w:t>期待</w:t>
+            </w:r>
+          </w:p>
+        </w:tc>
+      </w:tr>
+      <w:tr>
+        <w:tc>
+          <w:tcPr>
+            <w:tcW w:type="dxa" w:w="2880"/>
+          </w:tcPr>
+          <w:p>
+            <w:r>
+              <w:t>B1–B13</w:t>
+            </w:r>
+          </w:p>
+        </w:tc>
+        <w:tc>
+          <w:tcPr>
+            <w:tcW w:type="dxa" w:w="2880"/>
+          </w:tcPr>
+          <w:p>
+            <w:r>
+              <w:t>正常・適合データ（上限境界・ムンプス床を含む）</w:t>
+            </w:r>
+          </w:p>
+        </w:tc>
+        <w:tc>
+          <w:tcPr>
+            <w:tcW w:type="dxa" w:w="2880"/>
+          </w:tcPr>
+          <w:p>
+            <w:r>
+              <w:t>PASS</w:t>
+            </w:r>
+          </w:p>
+        </w:tc>
+      </w:tr>
+      <w:tr>
+        <w:tc>
+          <w:tcPr>
+            <w:tcW w:type="dxa" w:w="2880"/>
+          </w:tcPr>
+          <w:p>
+            <w:r>
+              <w:t>M3</w:t>
+            </w:r>
+          </w:p>
+        </w:tc>
+        <w:tc>
+          <w:tcPr>
+            <w:tcW w:type="dxa" w:w="2880"/>
+          </w:tcPr>
+          <w:p>
+            <w:r>
+              <w:t>5 dB刻みを外した43 dB</w:t>
+            </w:r>
+          </w:p>
+        </w:tc>
+        <w:tc>
+          <w:tcPr>
+            <w:tcW w:type="dxa" w:w="2880"/>
+          </w:tcPr>
+          <w:p>
+            <w:r>
+              <w:t>FAIL</w:t>
+            </w:r>
+          </w:p>
+        </w:tc>
+      </w:tr>
+      <w:tr>
+        <w:tc>
+          <w:tcPr>
+            <w:tcW w:type="dxa" w:w="2880"/>
+          </w:tcPr>
+          <w:p>
+            <w:r>
+              <w:t>M6</w:t>
+            </w:r>
+          </w:p>
+        </w:tc>
+        <w:tc>
+          <w:tcPr>
+            <w:tcW w:type="dxa" w:w="2880"/>
+          </w:tcPr>
+          <w:p>
+            <w:r>
+              <w:t>正常例でABG 20 dB</w:t>
+            </w:r>
+          </w:p>
+        </w:tc>
+        <w:tc>
+          <w:tcPr>
+            <w:tcW w:type="dxa" w:w="2880"/>
+          </w:tcPr>
+          <w:p>
+            <w:r>
+              <w:t>FAIL</w:t>
+            </w:r>
+          </w:p>
+        </w:tc>
+      </w:tr>
+      <w:tr>
+        <w:tc>
+          <w:tcPr>
+            <w:tcW w:type="dxa" w:w="2880"/>
+          </w:tcPr>
+          <w:p>
+            <w:r>
+              <w:t>M7</w:t>
+            </w:r>
+          </w:p>
+        </w:tc>
+        <w:tc>
+          <w:tcPr>
+            <w:tcW w:type="dxa" w:w="2880"/>
+          </w:tcPr>
+          <w:p>
+            <w:r>
+              <w:t>感音難聴でBCがACより大きく上昇</w:t>
+            </w:r>
+          </w:p>
+        </w:tc>
+        <w:tc>
+          <w:tcPr>
+            <w:tcW w:type="dxa" w:w="2880"/>
+          </w:tcPr>
+          <w:p>
+            <w:r>
+              <w:t>FAIL</w:t>
+            </w:r>
+          </w:p>
+        </w:tc>
+      </w:tr>
+      <w:tr>
+        <w:tc>
+          <w:tcPr>
+            <w:tcW w:type="dxa" w:w="2880"/>
+          </w:tcPr>
+          <w:p>
+            <w:r>
+              <w:t>M2</w:t>
+            </w:r>
+          </w:p>
+        </w:tc>
+        <w:tc>
+          <w:tcPr>
+            <w:tcW w:type="dxa" w:w="2880"/>
+          </w:tcPr>
+          <w:p>
+            <w:r>
+              <w:t>伝音難聴で必要ABGを消失</w:t>
+            </w:r>
+          </w:p>
+        </w:tc>
+        <w:tc>
+          <w:tcPr>
+            <w:tcW w:type="dxa" w:w="2880"/>
+          </w:tcPr>
+          <w:p>
+            <w:r>
+              <w:t>FAIL</w:t>
+            </w:r>
+          </w:p>
+        </w:tc>
+      </w:tr>
+      <w:tr>
+        <w:tc>
+          <w:tcPr>
+            <w:tcW w:type="dxa" w:w="2880"/>
+          </w:tcPr>
+          <w:p>
+            <w:r>
+              <w:t>M1</w:t>
+            </w:r>
+          </w:p>
+        </w:tc>
+        <w:tc>
+          <w:tcPr>
+            <w:tcW w:type="dxa" w:w="2880"/>
+          </w:tcPr>
+          <w:p>
+            <w:r>
+              <w:t>騒音性難聴でC5-dip消失</w:t>
+            </w:r>
+          </w:p>
+        </w:tc>
+        <w:tc>
+          <w:tcPr>
+            <w:tcW w:type="dxa" w:w="2880"/>
+          </w:tcPr>
+          <w:p>
+            <w:r>
+              <w:t>FAIL</w:t>
+            </w:r>
+          </w:p>
+        </w:tc>
+      </w:tr>
+      <w:tr>
+        <w:tc>
+          <w:tcPr>
+            <w:tcW w:type="dxa" w:w="2880"/>
+          </w:tcPr>
+          <w:p>
+            <w:r>
+              <w:t>M4</w:t>
+            </w:r>
+          </w:p>
+        </w:tc>
+        <w:tc>
+          <w:tcPr>
+            <w:tcW w:type="dxa" w:w="2880"/>
+          </w:tcPr>
+          <w:p>
+            <w:r>
+              <w:t>突発性難聴で左右差&lt;30 dB</w:t>
+            </w:r>
+          </w:p>
+        </w:tc>
+        <w:tc>
+          <w:tcPr>
+            <w:tcW w:type="dxa" w:w="2880"/>
+          </w:tcPr>
+          <w:p>
+            <w:r>
+              <w:t>FAIL</w:t>
+            </w:r>
+          </w:p>
+        </w:tc>
+      </w:tr>
+      <w:tr>
+        <w:tc>
+          <w:tcPr>
+            <w:tcW w:type="dxa" w:w="2880"/>
+          </w:tcPr>
+          <w:p>
+            <w:r>
+              <w:t>M12</w:t>
+            </w:r>
+          </w:p>
+        </w:tc>
+        <w:tc>
+          <w:tcPr>
+            <w:tcW w:type="dxa" w:w="2880"/>
+          </w:tcPr>
+          <w:p>
+            <w:r>
+              <w:t>程度を上げたのに閾値が低下</w:t>
+            </w:r>
+          </w:p>
+        </w:tc>
+        <w:tc>
+          <w:tcPr>
+            <w:tcW w:type="dxa" w:w="2880"/>
+          </w:tcPr>
+          <w:p>
+            <w:r>
+              <w:t>FAIL</w:t>
+            </w:r>
+          </w:p>
+        </w:tc>
+      </w:tr>
+      <w:tr>
+        <w:tc>
+          <w:tcPr>
+            <w:tcW w:type="dxa" w:w="2880"/>
+          </w:tcPr>
+          <w:p>
+            <w:r>
+              <w:t>M5</w:t>
+            </w:r>
+          </w:p>
+        </w:tc>
+        <w:tc>
+          <w:tcPr>
+            <w:tcW w:type="dxa" w:w="2880"/>
+          </w:tcPr>
+          <w:p>
+            <w:r>
+              <w:t>Carhart様変化の2 kHz BC上昇を消失</w:t>
+            </w:r>
+          </w:p>
+        </w:tc>
+        <w:tc>
+          <w:tcPr>
+            <w:tcW w:type="dxa" w:w="2880"/>
+          </w:tcPr>
+          <w:p>
+            <w:r>
+              <w:t>FAIL</w:t>
+            </w:r>
+          </w:p>
+        </w:tc>
+      </w:tr>
+      <w:tr>
+        <w:tc>
+          <w:tcPr>
+            <w:tcW w:type="dxa" w:w="2880"/>
+          </w:tcPr>
+          <w:p>
+            <w:r>
+              <w:t>M13</w:t>
+            </w:r>
+          </w:p>
+        </w:tc>
+        <w:tc>
+          <w:tcPr>
+            <w:tcW w:type="dxa" w:w="2880"/>
+          </w:tcPr>
+          <w:p>
+            <w:r>
+              <w:t>規定外のスケールアウト（NormalにSO）</w:t>
+            </w:r>
+          </w:p>
+        </w:tc>
+        <w:tc>
+          <w:tcPr>
+            <w:tcW w:type="dxa" w:w="2880"/>
+          </w:tcPr>
+          <w:p>
+            <w:r>
+              <w:t>FAIL</w:t>
+            </w:r>
+          </w:p>
+        </w:tc>
+      </w:tr>
+      <w:tr>
+        <w:tc>
+          <w:tcPr>
+            <w:tcW w:type="dxa" w:w="2880"/>
+          </w:tcPr>
+          <w:p>
+            <w:r>
+              <w:t>M8</w:t>
+            </w:r>
+          </w:p>
+        </w:tc>
+        <w:tc>
+          <w:tcPr>
+            <w:tcW w:type="dxa" w:w="2880"/>
+          </w:tcPr>
+          <w:p>
+            <w:r>
+              <w:t>メタ疾患名と閾値の不一致</w:t>
+            </w:r>
+          </w:p>
+        </w:tc>
+        <w:tc>
+          <w:tcPr>
+            <w:tcW w:type="dxa" w:w="2880"/>
+          </w:tcPr>
+          <w:p>
+            <w:r>
+              <w:t>FAIL</w:t>
+            </w:r>
+          </w:p>
+        </w:tc>
+      </w:tr>
+      <w:tr>
+        <w:tc>
+          <w:tcPr>
+            <w:tcW w:type="dxa" w:w="2880"/>
+          </w:tcPr>
+          <w:p>
+            <w:r>
+              <w:t>M10</w:t>
+            </w:r>
+          </w:p>
+        </w:tc>
+        <w:tc>
+          <w:tcPr>
+            <w:tcW w:type="dxa" w:w="2880"/>
+          </w:tcPr>
+          <w:p>
+            <w:r>
+              <w:t>C1周波数がSOのみ</w:t>
+            </w:r>
+          </w:p>
+        </w:tc>
+        <w:tc>
+          <w:tcPr>
+            <w:tcW w:type="dxa" w:w="2880"/>
+          </w:tcPr>
+          <w:p>
+            <w:r>
+              <w:t>FAIL</w:t>
+            </w:r>
+          </w:p>
+        </w:tc>
+      </w:tr>
+      <w:tr>
+        <w:tc>
+          <w:tcPr>
+            <w:tcW w:type="dxa" w:w="2880"/>
+          </w:tcPr>
+          <w:p>
+            <w:r>
+              <w:t>M14</w:t>
+            </w:r>
+          </w:p>
+        </w:tc>
+        <w:tc>
+          <w:tcPr>
+            <w:tcW w:type="dxa" w:w="2880"/>
+          </w:tcPr>
+          <w:p>
+            <w:r>
+              <w:t>AOM混合型で4 kHz骨導上昇を消失</w:t>
+            </w:r>
+          </w:p>
+        </w:tc>
+        <w:tc>
+          <w:tcPr>
+            <w:tcW w:type="dxa" w:w="2880"/>
+          </w:tcPr>
+          <w:p>
+            <w:r>
+              <w:t>FAIL</w:t>
+            </w:r>
+          </w:p>
+        </w:tc>
+      </w:tr>
+      <w:tr>
+        <w:tc>
+          <w:tcPr>
+            <w:tcW w:type="dxa" w:w="2880"/>
+          </w:tcPr>
+          <w:p>
+            <w:r>
+              <w:t>M15</w:t>
+            </w:r>
+          </w:p>
+        </w:tc>
+        <w:tc>
+          <w:tcPr>
+            <w:tcW w:type="dxa" w:w="2880"/>
+          </w:tcPr>
+          <w:p>
+            <w:r>
+              <w:t>気導上限超過（上限＋5）</w:t>
+            </w:r>
+          </w:p>
+        </w:tc>
+        <w:tc>
+          <w:tcPr>
+            <w:tcW w:type="dxa" w:w="2880"/>
+          </w:tcPr>
+          <w:p>
+            <w:r>
+              <w:t>FAIL</w:t>
+            </w:r>
+          </w:p>
+        </w:tc>
+      </w:tr>
+      <w:tr>
+        <w:tc>
+          <w:tcPr>
+            <w:tcW w:type="dxa" w:w="2880"/>
+          </w:tcPr>
+          <w:p>
+            <w:r>
+              <w:t>M16</w:t>
+            </w:r>
+          </w:p>
+        </w:tc>
+        <w:tc>
+          <w:tcPr>
+            <w:tcW w:type="dxa" w:w="2880"/>
+          </w:tcPr>
+          <w:p>
+            <w:r>
+              <w:t>骨導上限超過（上限＋5）</w:t>
+            </w:r>
+          </w:p>
+        </w:tc>
+        <w:tc>
+          <w:tcPr>
+            <w:tcW w:type="dxa" w:w="2880"/>
+          </w:tcPr>
+          <w:p>
+            <w:r>
+              <w:t>FAIL</w:t>
+            </w:r>
+          </w:p>
+        </w:tc>
+      </w:tr>
+      <w:tr>
+        <w:tc>
+          <w:tcPr>
+            <w:tcW w:type="dxa" w:w="2880"/>
+          </w:tcPr>
+          <w:p>
+            <w:r>
+              <w:t>M17</w:t>
+            </w:r>
+          </w:p>
+        </w:tc>
+        <w:tc>
+          <w:tcPr>
+            <w:tcW w:type="dxa" w:w="2880"/>
+          </w:tcPr>
+          <w:p>
+            <w:r>
+              <w:t>気導下限未満（下限−5）</w:t>
+            </w:r>
+          </w:p>
+        </w:tc>
+        <w:tc>
+          <w:tcPr>
+            <w:tcW w:type="dxa" w:w="2880"/>
+          </w:tcPr>
+          <w:p>
+            <w:r>
+              <w:t>FAIL</w:t>
+            </w:r>
+          </w:p>
+        </w:tc>
+      </w:tr>
+      <w:tr>
+        <w:tc>
+          <w:tcPr>
+            <w:tcW w:type="dxa" w:w="2880"/>
+          </w:tcPr>
+          <w:p>
+            <w:r>
+              <w:t>M18</w:t>
+            </w:r>
+          </w:p>
+        </w:tc>
+        <w:tc>
+          <w:tcPr>
+            <w:tcW w:type="dxa" w:w="2880"/>
+          </w:tcPr>
+          <w:p>
+            <w:r>
+              <w:t>骨導下限未満（下限−5）</w:t>
+            </w:r>
+          </w:p>
+        </w:tc>
+        <w:tc>
+          <w:tcPr>
+            <w:tcW w:type="dxa" w:w="2880"/>
+          </w:tcPr>
+          <w:p>
+            <w:r>
+              <w:t>FAIL</w:t>
+            </w:r>
+          </w:p>
+        </w:tc>
+      </w:tr>
+      <w:tr>
+        <w:tc>
+          <w:tcPr>
+            <w:tcW w:type="dxa" w:w="2880"/>
+          </w:tcPr>
+          <w:p>
+            <w:r>
+              <w:t>M19</w:t>
+            </w:r>
+          </w:p>
+        </w:tc>
+        <w:tc>
+          <w:tcPr>
+            <w:tcW w:type="dxa" w:w="2880"/>
+          </w:tcPr>
+          <w:p>
+            <w:r>
+              <w:t>C5-dipが5 dBのみ（10 dB床未満）</w:t>
+            </w:r>
+          </w:p>
+        </w:tc>
+        <w:tc>
+          <w:tcPr>
+            <w:tcW w:type="dxa" w:w="2880"/>
+          </w:tcPr>
+          <w:p>
+            <w:r>
+              <w:t>FAIL</w:t>
+            </w:r>
+          </w:p>
+        </w:tc>
+      </w:tr>
+      <w:tr>
+        <w:tc>
+          <w:tcPr>
+            <w:tcW w:type="dxa" w:w="2880"/>
+          </w:tcPr>
+          <w:p>
+            <w:r>
+              <w:t>M20</w:t>
+            </w:r>
+          </w:p>
+        </w:tc>
+        <w:tc>
+          <w:tcPr>
+            <w:tcW w:type="dxa" w:w="2880"/>
+          </w:tcPr>
+          <w:p>
+            <w:r>
+              <w:t>ムンプスで病側平均が高度床未満</w:t>
+            </w:r>
+          </w:p>
+        </w:tc>
+        <w:tc>
+          <w:tcPr>
+            <w:tcW w:type="dxa" w:w="2880"/>
+          </w:tcPr>
+          <w:p>
+            <w:r>
+              <w:t>FAIL</w:t>
+            </w:r>
+          </w:p>
+        </w:tc>
+      </w:tr>
+    </w:tbl>
     <w:p>
       <w:r>
-        <w:t>- 突発性難聴（程度≥1）: 病側−対側 mean AC(0.5/1/2 kHz) ≥ **30 dB**。</w:t>
-      </w:r>
-    </w:p>
-    <w:p>
-      <w:r>
-        <w:t>- ムンプス難聴（程度≥1）: 病側 mean AC ≥ **70 dB** かつ一側差 ≥ **55 dB**（軽度は実質不使用）。</w:t>
-      </w:r>
-    </w:p>
-    <w:p>
-      <w:r>
-        <w:t>- 周波数別上下限: 数値閾値が教育用上下限の閉区間内（境界一致は適合）。</w:t>
-      </w:r>
-    </w:p>
-    <w:p>
-      <w:r>
-        <w:t>- Carhart様: BC2−mean(BC1,BC4)≥**5 dB**（5 dB丸め後に切痕形状として識別可能な最小深さとして著者設定。C5-dipの10 dB床とは目的が異なるため、床のdBは非対称である）。</w:t>
-      </w:r>
-    </w:p>
-    <w:p>
-      <w:r>
-        <w:t>- 異常系テスト: 正常・適合13項目 + 規則違反18項目 = **31項目**。</w:t>
+        <w:t>NaNや必要周波数の欠損など、生成器が通常出力しない無効値は本稿の異常系対象外とした。</w:t>
       </w:r>
     </w:p>
     <w:p>
@@ -377,12 +3290,27 @@
         <w:pStyle w:val="Heading2"/>
       </w:pPr>
       <w:r>
-        <w:t>付録追記2．異常系テスト</w:t>
+        <w:t>6．補足</w:t>
       </w:r>
     </w:p>
     <w:p>
       <w:r>
-        <w:t>`npm run verify:audiogram:mutations` → 31/31。対応表は `docs/pilot-study/verification/NEGATIVE_TEST_cases.md`。</w:t>
+        <w:t>・T7（突発一側差の焦点検証）は程度を中等度（程度2）に固定した条件であり、程度別の記述統計とは対象が異なる。規則床は程度≥1と同じ≥30 dBである。</w:t>
+      </w:r>
+    </w:p>
+    <w:p>
+      <w:r>
+        <w:t>・ASA/ANSI S3.6およびISO 8253-1は、オージオメータ仕様および純音聴力検査手順の参照であり、生成器そのものの規格認証を意味しない。</w:t>
+      </w:r>
+    </w:p>
+    <w:p>
+      <w:r>
+        <w:t>・本付録は出力規則への適合確認の詳細であり、生成像の臨床的妥当性や教育効果を示すものではない。</w:t>
+      </w:r>
+    </w:p>
+    <w:p>
+      <w:r>
+        <w:t>・伝音ABGはパターン別に集計した（滲出性／急性・伝音型／急性・混合型／耳硬化／耳小骨離断）。詳細は表3を参照。</w:t>
       </w:r>
     </w:p>
     <w:sectPr>
@@ -758,6 +3686,10 @@
     <w:name w:val="Normal"/>
     <w:qFormat/>
     <w:rsid w:val="00FC693F"/>
+    <w:rPr>
+      <w:rFonts w:ascii="游明朝" w:hAnsi="游明朝"/>
+      <w:sz w:val="21"/>
+    </w:rPr>
   </w:style>
   <w:style w:type="paragraph" w:styleId="Header">
     <w:name w:val="header"/>

</xml_diff>

<commit_message>
Fix v2.32 T8 memo truncation and ISO 125 Hz wording.
Restore the full T8 profile breakdown below the rates table, correct the ISO 125 Hz implementation note, expand the reference-value table with representative ages, and polish limitations/EN abstract.

Co-authored-by: Cursor <cursoragent@cursor.com>
</commit_message>
<xml_diff>
--- a/docs/pilot-study/manuscripts/Supplement1_verification.docx
+++ b/docs/pilot-study/manuscripts/Supplement1_verification.docx
@@ -35,7 +35,7 @@
     </w:p>
     <w:p>
       <w:r>
-        <w:t>・実行日時：2026-09-04T14:18:50.939Z（Node.js v22.20.0 / darwin / audioscope-edu 1.0.0）</w:t>
+        <w:t>・実行日時：2026-09-04T14:18:50.939Z（Node.js v22.20.0 / macOS 26.5.2 / audioscope-edu 1.0.0）</w:t>
       </w:r>
     </w:p>
     <w:p>
@@ -88,7 +88,7 @@
     </w:p>
     <w:p>
       <w:r>
-        <w:t>規格本文の表は転載しない。実装した教育用JSONから、気導中央値（dB HL）の要約を示す。0.125 kHzはISO表にないため教育用に隣接帯から補間・拘束している。骨導基準はISOが直接規定するものではなく、気骨導関係の著者規則から生成する。</w:t>
+        <w:t>規格本文の表は転載しない。実装した教育用JSONの気導中央値（dB HL）を示す。各年齢群の代表年齢は、ISO 7029:2017の式に代入した年齢として 20歳代＝20歳、30歳代＝30歳、40歳代＝40歳、50歳代＝50歳、60歳代＝60歳、70歳代＝70歳 （各群の下限年齢）とした。ISO 7029:2017の係数表は125 Hzならびに1.5・3・6 kHzを含む。本システムの生成周波数は0.125・0.25・0.5・1・2・4・8 kHzであり、1.5・3・6 kHzは未実装である。0.125 kHzはISO係数表に含まれるが、現行の参照JSONには0.25–8 kHzのみを格納しているため、実装上は0.25 kHzの参照値を流用し、周波数別の教育用上下限で拘束している（規格値の隣接帯補間ではない）。骨導基準はISOが直接規定するものではなく、気骨導関係の著者規則から生成する。</w:t>
       </w:r>
     </w:p>
     <w:tbl>
@@ -98,18 +98,21 @@
         <w:tblLook w:firstColumn="1" w:firstRow="1" w:lastColumn="0" w:lastRow="0" w:noHBand="0" w:noVBand="1" w:val="04A0"/>
       </w:tblPr>
       <w:tblGrid>
-        <w:gridCol w:w="1234"/>
-        <w:gridCol w:w="1234"/>
-        <w:gridCol w:w="1234"/>
-        <w:gridCol w:w="1234"/>
-        <w:gridCol w:w="1234"/>
-        <w:gridCol w:w="1234"/>
-        <w:gridCol w:w="1234"/>
+        <w:gridCol w:w="864"/>
+        <w:gridCol w:w="864"/>
+        <w:gridCol w:w="864"/>
+        <w:gridCol w:w="864"/>
+        <w:gridCol w:w="864"/>
+        <w:gridCol w:w="864"/>
+        <w:gridCol w:w="864"/>
+        <w:gridCol w:w="864"/>
+        <w:gridCol w:w="864"/>
+        <w:gridCol w:w="864"/>
       </w:tblGrid>
       <w:tr>
         <w:tc>
           <w:tcPr>
-            <w:tcW w:type="dxa" w:w="1234"/>
+            <w:tcW w:type="dxa" w:w="864"/>
           </w:tcPr>
           <w:p>
             <w:r>
@@ -119,7 +122,7 @@
         </w:tc>
         <w:tc>
           <w:tcPr>
-            <w:tcW w:type="dxa" w:w="1234"/>
+            <w:tcW w:type="dxa" w:w="864"/>
           </w:tcPr>
           <w:p>
             <w:r>
@@ -129,7 +132,37 @@
         </w:tc>
         <w:tc>
           <w:tcPr>
-            <w:tcW w:type="dxa" w:w="1234"/>
+            <w:tcW w:type="dxa" w:w="864"/>
+          </w:tcPr>
+          <w:p>
+            <w:r>
+              <w:t>代表年齢</w:t>
+            </w:r>
+          </w:p>
+        </w:tc>
+        <w:tc>
+          <w:tcPr>
+            <w:tcW w:type="dxa" w:w="864"/>
+          </w:tcPr>
+          <w:p>
+            <w:r>
+              <w:t>0.125 kHz</w:t>
+            </w:r>
+          </w:p>
+        </w:tc>
+        <w:tc>
+          <w:tcPr>
+            <w:tcW w:type="dxa" w:w="864"/>
+          </w:tcPr>
+          <w:p>
+            <w:r>
+              <w:t>0.25 kHz</w:t>
+            </w:r>
+          </w:p>
+        </w:tc>
+        <w:tc>
+          <w:tcPr>
+            <w:tcW w:type="dxa" w:w="864"/>
           </w:tcPr>
           <w:p>
             <w:r>
@@ -139,7 +172,7 @@
         </w:tc>
         <w:tc>
           <w:tcPr>
-            <w:tcW w:type="dxa" w:w="1234"/>
+            <w:tcW w:type="dxa" w:w="864"/>
           </w:tcPr>
           <w:p>
             <w:r>
@@ -149,7 +182,7 @@
         </w:tc>
         <w:tc>
           <w:tcPr>
-            <w:tcW w:type="dxa" w:w="1234"/>
+            <w:tcW w:type="dxa" w:w="864"/>
           </w:tcPr>
           <w:p>
             <w:r>
@@ -159,7 +192,7 @@
         </w:tc>
         <w:tc>
           <w:tcPr>
-            <w:tcW w:type="dxa" w:w="1234"/>
+            <w:tcW w:type="dxa" w:w="864"/>
           </w:tcPr>
           <w:p>
             <w:r>
@@ -169,7 +202,7 @@
         </w:tc>
         <w:tc>
           <w:tcPr>
-            <w:tcW w:type="dxa" w:w="1234"/>
+            <w:tcW w:type="dxa" w:w="864"/>
           </w:tcPr>
           <w:p>
             <w:r>
@@ -181,7 +214,7 @@
       <w:tr>
         <w:tc>
           <w:tcPr>
-            <w:tcW w:type="dxa" w:w="1234"/>
+            <w:tcW w:type="dxa" w:w="864"/>
           </w:tcPr>
           <w:p>
             <w:r>
@@ -191,7 +224,7 @@
         </w:tc>
         <w:tc>
           <w:tcPr>
-            <w:tcW w:type="dxa" w:w="1234"/>
+            <w:tcW w:type="dxa" w:w="864"/>
           </w:tcPr>
           <w:p>
             <w:r>
@@ -201,7 +234,17 @@
         </w:tc>
         <w:tc>
           <w:tcPr>
-            <w:tcW w:type="dxa" w:w="1234"/>
+            <w:tcW w:type="dxa" w:w="864"/>
+          </w:tcPr>
+          <w:p>
+            <w:r>
+              <w:t>20</w:t>
+            </w:r>
+          </w:p>
+        </w:tc>
+        <w:tc>
+          <w:tcPr>
+            <w:tcW w:type="dxa" w:w="864"/>
           </w:tcPr>
           <w:p>
             <w:r>
@@ -211,7 +254,7 @@
         </w:tc>
         <w:tc>
           <w:tcPr>
-            <w:tcW w:type="dxa" w:w="1234"/>
+            <w:tcW w:type="dxa" w:w="864"/>
           </w:tcPr>
           <w:p>
             <w:r>
@@ -221,7 +264,7 @@
         </w:tc>
         <w:tc>
           <w:tcPr>
-            <w:tcW w:type="dxa" w:w="1234"/>
+            <w:tcW w:type="dxa" w:w="864"/>
           </w:tcPr>
           <w:p>
             <w:r>
@@ -231,7 +274,7 @@
         </w:tc>
         <w:tc>
           <w:tcPr>
-            <w:tcW w:type="dxa" w:w="1234"/>
+            <w:tcW w:type="dxa" w:w="864"/>
           </w:tcPr>
           <w:p>
             <w:r>
@@ -241,7 +284,27 @@
         </w:tc>
         <w:tc>
           <w:tcPr>
-            <w:tcW w:type="dxa" w:w="1234"/>
+            <w:tcW w:type="dxa" w:w="864"/>
+          </w:tcPr>
+          <w:p>
+            <w:r>
+              <w:t>0.0</w:t>
+            </w:r>
+          </w:p>
+        </w:tc>
+        <w:tc>
+          <w:tcPr>
+            <w:tcW w:type="dxa" w:w="864"/>
+          </w:tcPr>
+          <w:p>
+            <w:r>
+              <w:t>0.0</w:t>
+            </w:r>
+          </w:p>
+        </w:tc>
+        <w:tc>
+          <w:tcPr>
+            <w:tcW w:type="dxa" w:w="864"/>
           </w:tcPr>
           <w:p>
             <w:r>
@@ -253,7 +316,7 @@
       <w:tr>
         <w:tc>
           <w:tcPr>
-            <w:tcW w:type="dxa" w:w="1234"/>
+            <w:tcW w:type="dxa" w:w="864"/>
           </w:tcPr>
           <w:p>
             <w:r>
@@ -263,61 +326,91 @@
         </w:tc>
         <w:tc>
           <w:tcPr>
-            <w:tcW w:type="dxa" w:w="1234"/>
-          </w:tcPr>
-          <w:p>
-            <w:r>
-              <w:t>50s</w:t>
-            </w:r>
-          </w:p>
-        </w:tc>
-        <w:tc>
-          <w:tcPr>
-            <w:tcW w:type="dxa" w:w="1234"/>
-          </w:tcPr>
-          <w:p>
-            <w:r>
-              <w:t>3.0</w:t>
-            </w:r>
-          </w:p>
-        </w:tc>
-        <w:tc>
-          <w:tcPr>
-            <w:tcW w:type="dxa" w:w="1234"/>
-          </w:tcPr>
-          <w:p>
-            <w:r>
-              <w:t>4.0</w:t>
-            </w:r>
-          </w:p>
-        </w:tc>
-        <w:tc>
-          <w:tcPr>
-            <w:tcW w:type="dxa" w:w="1234"/>
-          </w:tcPr>
-          <w:p>
-            <w:r>
-              <w:t>6.5</w:t>
-            </w:r>
-          </w:p>
-        </w:tc>
-        <w:tc>
-          <w:tcPr>
-            <w:tcW w:type="dxa" w:w="1234"/>
-          </w:tcPr>
-          <w:p>
-            <w:r>
-              <w:t>10.7</w:t>
-            </w:r>
-          </w:p>
-        </w:tc>
-        <w:tc>
-          <w:tcPr>
-            <w:tcW w:type="dxa" w:w="1234"/>
-          </w:tcPr>
-          <w:p>
-            <w:r>
-              <w:t>16.1</w:t>
+            <w:tcW w:type="dxa" w:w="864"/>
+          </w:tcPr>
+          <w:p>
+            <w:r>
+              <w:t>30s</w:t>
+            </w:r>
+          </w:p>
+        </w:tc>
+        <w:tc>
+          <w:tcPr>
+            <w:tcW w:type="dxa" w:w="864"/>
+          </w:tcPr>
+          <w:p>
+            <w:r>
+              <w:t>30</w:t>
+            </w:r>
+          </w:p>
+        </w:tc>
+        <w:tc>
+          <w:tcPr>
+            <w:tcW w:type="dxa" w:w="864"/>
+          </w:tcPr>
+          <w:p>
+            <w:r>
+              <w:t>0.2</w:t>
+            </w:r>
+          </w:p>
+        </w:tc>
+        <w:tc>
+          <w:tcPr>
+            <w:tcW w:type="dxa" w:w="864"/>
+          </w:tcPr>
+          <w:p>
+            <w:r>
+              <w:t>0.2</w:t>
+            </w:r>
+          </w:p>
+        </w:tc>
+        <w:tc>
+          <w:tcPr>
+            <w:tcW w:type="dxa" w:w="864"/>
+          </w:tcPr>
+          <w:p>
+            <w:r>
+              <w:t>0.3</w:t>
+            </w:r>
+          </w:p>
+        </w:tc>
+        <w:tc>
+          <w:tcPr>
+            <w:tcW w:type="dxa" w:w="864"/>
+          </w:tcPr>
+          <w:p>
+            <w:r>
+              <w:t>0.3</w:t>
+            </w:r>
+          </w:p>
+        </w:tc>
+        <w:tc>
+          <w:tcPr>
+            <w:tcW w:type="dxa" w:w="864"/>
+          </w:tcPr>
+          <w:p>
+            <w:r>
+              <w:t>0.6</w:t>
+            </w:r>
+          </w:p>
+        </w:tc>
+        <w:tc>
+          <w:tcPr>
+            <w:tcW w:type="dxa" w:w="864"/>
+          </w:tcPr>
+          <w:p>
+            <w:r>
+              <w:t>1.1</w:t>
+            </w:r>
+          </w:p>
+        </w:tc>
+        <w:tc>
+          <w:tcPr>
+            <w:tcW w:type="dxa" w:w="864"/>
+          </w:tcPr>
+          <w:p>
+            <w:r>
+              <w:t>1.6</w:t>
             </w:r>
           </w:p>
         </w:tc>
@@ -325,7 +418,7 @@
       <w:tr>
         <w:tc>
           <w:tcPr>
-            <w:tcW w:type="dxa" w:w="1234"/>
+            <w:tcW w:type="dxa" w:w="864"/>
           </w:tcPr>
           <w:p>
             <w:r>
@@ -335,61 +428,91 @@
         </w:tc>
         <w:tc>
           <w:tcPr>
-            <w:tcW w:type="dxa" w:w="1234"/>
-          </w:tcPr>
-          <w:p>
-            <w:r>
-              <w:t>70s</w:t>
-            </w:r>
-          </w:p>
-        </w:tc>
-        <w:tc>
-          <w:tcPr>
-            <w:tcW w:type="dxa" w:w="1234"/>
-          </w:tcPr>
-          <w:p>
-            <w:r>
-              <w:t>10.4</w:t>
-            </w:r>
-          </w:p>
-        </w:tc>
-        <w:tc>
-          <w:tcPr>
-            <w:tcW w:type="dxa" w:w="1234"/>
-          </w:tcPr>
-          <w:p>
-            <w:r>
-              <w:t>13.4</w:t>
-            </w:r>
-          </w:p>
-        </w:tc>
-        <w:tc>
-          <w:tcPr>
-            <w:tcW w:type="dxa" w:w="1234"/>
-          </w:tcPr>
-          <w:p>
-            <w:r>
-              <w:t>20.8</w:t>
-            </w:r>
-          </w:p>
-        </w:tc>
-        <w:tc>
-          <w:tcPr>
-            <w:tcW w:type="dxa" w:w="1234"/>
-          </w:tcPr>
-          <w:p>
-            <w:r>
-              <w:t>33.2</w:t>
-            </w:r>
-          </w:p>
-        </w:tc>
-        <w:tc>
-          <w:tcPr>
-            <w:tcW w:type="dxa" w:w="1234"/>
-          </w:tcPr>
-          <w:p>
-            <w:r>
-              <w:t>50.0</w:t>
+            <w:tcW w:type="dxa" w:w="864"/>
+          </w:tcPr>
+          <w:p>
+            <w:r>
+              <w:t>40s</w:t>
+            </w:r>
+          </w:p>
+        </w:tc>
+        <w:tc>
+          <w:tcPr>
+            <w:tcW w:type="dxa" w:w="864"/>
+          </w:tcPr>
+          <w:p>
+            <w:r>
+              <w:t>40</w:t>
+            </w:r>
+          </w:p>
+        </w:tc>
+        <w:tc>
+          <w:tcPr>
+            <w:tcW w:type="dxa" w:w="864"/>
+          </w:tcPr>
+          <w:p>
+            <w:r>
+              <w:t>0.9</w:t>
+            </w:r>
+          </w:p>
+        </w:tc>
+        <w:tc>
+          <w:tcPr>
+            <w:tcW w:type="dxa" w:w="864"/>
+          </w:tcPr>
+          <w:p>
+            <w:r>
+              <w:t>0.9</w:t>
+            </w:r>
+          </w:p>
+        </w:tc>
+        <w:tc>
+          <w:tcPr>
+            <w:tcW w:type="dxa" w:w="864"/>
+          </w:tcPr>
+          <w:p>
+            <w:r>
+              <w:t>1.2</w:t>
+            </w:r>
+          </w:p>
+        </w:tc>
+        <w:tc>
+          <w:tcPr>
+            <w:tcW w:type="dxa" w:w="864"/>
+          </w:tcPr>
+          <w:p>
+            <w:r>
+              <w:t>1.6</w:t>
+            </w:r>
+          </w:p>
+        </w:tc>
+        <w:tc>
+          <w:tcPr>
+            <w:tcW w:type="dxa" w:w="864"/>
+          </w:tcPr>
+          <w:p>
+            <w:r>
+              <w:t>2.6</w:t>
+            </w:r>
+          </w:p>
+        </w:tc>
+        <w:tc>
+          <w:tcPr>
+            <w:tcW w:type="dxa" w:w="864"/>
+          </w:tcPr>
+          <w:p>
+            <w:r>
+              <w:t>4.5</w:t>
+            </w:r>
+          </w:p>
+        </w:tc>
+        <w:tc>
+          <w:tcPr>
+            <w:tcW w:type="dxa" w:w="864"/>
+          </w:tcPr>
+          <w:p>
+            <w:r>
+              <w:t>6.8</w:t>
             </w:r>
           </w:p>
         </w:tc>
@@ -397,71 +520,101 @@
       <w:tr>
         <w:tc>
           <w:tcPr>
-            <w:tcW w:type="dxa" w:w="1234"/>
-          </w:tcPr>
-          <w:p>
-            <w:r>
-              <w:t>女性</w:t>
-            </w:r>
-          </w:p>
-        </w:tc>
-        <w:tc>
-          <w:tcPr>
-            <w:tcW w:type="dxa" w:w="1234"/>
-          </w:tcPr>
-          <w:p>
-            <w:r>
-              <w:t>20s</w:t>
-            </w:r>
-          </w:p>
-        </w:tc>
-        <w:tc>
-          <w:tcPr>
-            <w:tcW w:type="dxa" w:w="1234"/>
-          </w:tcPr>
-          <w:p>
-            <w:r>
-              <w:t>0.0</w:t>
-            </w:r>
-          </w:p>
-        </w:tc>
-        <w:tc>
-          <w:tcPr>
-            <w:tcW w:type="dxa" w:w="1234"/>
-          </w:tcPr>
-          <w:p>
-            <w:r>
-              <w:t>0.0</w:t>
-            </w:r>
-          </w:p>
-        </w:tc>
-        <w:tc>
-          <w:tcPr>
-            <w:tcW w:type="dxa" w:w="1234"/>
-          </w:tcPr>
-          <w:p>
-            <w:r>
-              <w:t>0.0</w:t>
-            </w:r>
-          </w:p>
-        </w:tc>
-        <w:tc>
-          <w:tcPr>
-            <w:tcW w:type="dxa" w:w="1234"/>
-          </w:tcPr>
-          <w:p>
-            <w:r>
-              <w:t>0.0</w:t>
-            </w:r>
-          </w:p>
-        </w:tc>
-        <w:tc>
-          <w:tcPr>
-            <w:tcW w:type="dxa" w:w="1234"/>
-          </w:tcPr>
-          <w:p>
-            <w:r>
-              <w:t>0.0</w:t>
+            <w:tcW w:type="dxa" w:w="864"/>
+          </w:tcPr>
+          <w:p>
+            <w:r>
+              <w:t>男性</w:t>
+            </w:r>
+          </w:p>
+        </w:tc>
+        <w:tc>
+          <w:tcPr>
+            <w:tcW w:type="dxa" w:w="864"/>
+          </w:tcPr>
+          <w:p>
+            <w:r>
+              <w:t>50s</w:t>
+            </w:r>
+          </w:p>
+        </w:tc>
+        <w:tc>
+          <w:tcPr>
+            <w:tcW w:type="dxa" w:w="864"/>
+          </w:tcPr>
+          <w:p>
+            <w:r>
+              <w:t>50</w:t>
+            </w:r>
+          </w:p>
+        </w:tc>
+        <w:tc>
+          <w:tcPr>
+            <w:tcW w:type="dxa" w:w="864"/>
+          </w:tcPr>
+          <w:p>
+            <w:r>
+              <w:t>2.5</w:t>
+            </w:r>
+          </w:p>
+        </w:tc>
+        <w:tc>
+          <w:tcPr>
+            <w:tcW w:type="dxa" w:w="864"/>
+          </w:tcPr>
+          <w:p>
+            <w:r>
+              <w:t>2.5</w:t>
+            </w:r>
+          </w:p>
+        </w:tc>
+        <w:tc>
+          <w:tcPr>
+            <w:tcW w:type="dxa" w:w="864"/>
+          </w:tcPr>
+          <w:p>
+            <w:r>
+              <w:t>3.0</w:t>
+            </w:r>
+          </w:p>
+        </w:tc>
+        <w:tc>
+          <w:tcPr>
+            <w:tcW w:type="dxa" w:w="864"/>
+          </w:tcPr>
+          <w:p>
+            <w:r>
+              <w:t>4.0</w:t>
+            </w:r>
+          </w:p>
+        </w:tc>
+        <w:tc>
+          <w:tcPr>
+            <w:tcW w:type="dxa" w:w="864"/>
+          </w:tcPr>
+          <w:p>
+            <w:r>
+              <w:t>6.5</w:t>
+            </w:r>
+          </w:p>
+        </w:tc>
+        <w:tc>
+          <w:tcPr>
+            <w:tcW w:type="dxa" w:w="864"/>
+          </w:tcPr>
+          <w:p>
+            <w:r>
+              <w:t>10.7</w:t>
+            </w:r>
+          </w:p>
+        </w:tc>
+        <w:tc>
+          <w:tcPr>
+            <w:tcW w:type="dxa" w:w="864"/>
+          </w:tcPr>
+          <w:p>
+            <w:r>
+              <w:t>16.1</w:t>
             </w:r>
           </w:p>
         </w:tc>
@@ -469,71 +622,101 @@
       <w:tr>
         <w:tc>
           <w:tcPr>
-            <w:tcW w:type="dxa" w:w="1234"/>
-          </w:tcPr>
-          <w:p>
-            <w:r>
-              <w:t>女性</w:t>
-            </w:r>
-          </w:p>
-        </w:tc>
-        <w:tc>
-          <w:tcPr>
-            <w:tcW w:type="dxa" w:w="1234"/>
-          </w:tcPr>
-          <w:p>
-            <w:r>
-              <w:t>50s</w:t>
-            </w:r>
-          </w:p>
-        </w:tc>
-        <w:tc>
-          <w:tcPr>
-            <w:tcW w:type="dxa" w:w="1234"/>
-          </w:tcPr>
-          <w:p>
-            <w:r>
-              <w:t>3.1</w:t>
-            </w:r>
-          </w:p>
-        </w:tc>
-        <w:tc>
-          <w:tcPr>
-            <w:tcW w:type="dxa" w:w="1234"/>
-          </w:tcPr>
-          <w:p>
-            <w:r>
-              <w:t>3.7</w:t>
-            </w:r>
-          </w:p>
-        </w:tc>
-        <w:tc>
-          <w:tcPr>
-            <w:tcW w:type="dxa" w:w="1234"/>
-          </w:tcPr>
-          <w:p>
-            <w:r>
-              <w:t>5.0</w:t>
-            </w:r>
-          </w:p>
-        </w:tc>
-        <w:tc>
-          <w:tcPr>
-            <w:tcW w:type="dxa" w:w="1234"/>
-          </w:tcPr>
-          <w:p>
-            <w:r>
-              <w:t>7.4</w:t>
-            </w:r>
-          </w:p>
-        </w:tc>
-        <w:tc>
-          <w:tcPr>
-            <w:tcW w:type="dxa" w:w="1234"/>
-          </w:tcPr>
-          <w:p>
-            <w:r>
-              <w:t>11.9</w:t>
+            <w:tcW w:type="dxa" w:w="864"/>
+          </w:tcPr>
+          <w:p>
+            <w:r>
+              <w:t>男性</w:t>
+            </w:r>
+          </w:p>
+        </w:tc>
+        <w:tc>
+          <w:tcPr>
+            <w:tcW w:type="dxa" w:w="864"/>
+          </w:tcPr>
+          <w:p>
+            <w:r>
+              <w:t>60s</w:t>
+            </w:r>
+          </w:p>
+        </w:tc>
+        <w:tc>
+          <w:tcPr>
+            <w:tcW w:type="dxa" w:w="864"/>
+          </w:tcPr>
+          <w:p>
+            <w:r>
+              <w:t>60</w:t>
+            </w:r>
+          </w:p>
+        </w:tc>
+        <w:tc>
+          <w:tcPr>
+            <w:tcW w:type="dxa" w:w="864"/>
+          </w:tcPr>
+          <w:p>
+            <w:r>
+              <w:t>5.5</w:t>
+            </w:r>
+          </w:p>
+        </w:tc>
+        <w:tc>
+          <w:tcPr>
+            <w:tcW w:type="dxa" w:w="864"/>
+          </w:tcPr>
+          <w:p>
+            <w:r>
+              <w:t>5.5</w:t>
+            </w:r>
+          </w:p>
+        </w:tc>
+        <w:tc>
+          <w:tcPr>
+            <w:tcW w:type="dxa" w:w="864"/>
+          </w:tcPr>
+          <w:p>
+            <w:r>
+              <w:t>6.0</w:t>
+            </w:r>
+          </w:p>
+        </w:tc>
+        <w:tc>
+          <w:tcPr>
+            <w:tcW w:type="dxa" w:w="864"/>
+          </w:tcPr>
+          <w:p>
+            <w:r>
+              <w:t>7.8</w:t>
+            </w:r>
+          </w:p>
+        </w:tc>
+        <w:tc>
+          <w:tcPr>
+            <w:tcW w:type="dxa" w:w="864"/>
+          </w:tcPr>
+          <w:p>
+            <w:r>
+              <w:t>12.5</w:t>
+            </w:r>
+          </w:p>
+        </w:tc>
+        <w:tc>
+          <w:tcPr>
+            <w:tcW w:type="dxa" w:w="864"/>
+          </w:tcPr>
+          <w:p>
+            <w:r>
+              <w:t>20.2</w:t>
+            </w:r>
+          </w:p>
+        </w:tc>
+        <w:tc>
+          <w:tcPr>
+            <w:tcW w:type="dxa" w:w="864"/>
+          </w:tcPr>
+          <w:p>
+            <w:r>
+              <w:t>30.4</w:t>
             </w:r>
           </w:p>
         </w:tc>
@@ -541,7 +724,109 @@
       <w:tr>
         <w:tc>
           <w:tcPr>
-            <w:tcW w:type="dxa" w:w="1234"/>
+            <w:tcW w:type="dxa" w:w="864"/>
+          </w:tcPr>
+          <w:p>
+            <w:r>
+              <w:t>男性</w:t>
+            </w:r>
+          </w:p>
+        </w:tc>
+        <w:tc>
+          <w:tcPr>
+            <w:tcW w:type="dxa" w:w="864"/>
+          </w:tcPr>
+          <w:p>
+            <w:r>
+              <w:t>70s</w:t>
+            </w:r>
+          </w:p>
+        </w:tc>
+        <w:tc>
+          <w:tcPr>
+            <w:tcW w:type="dxa" w:w="864"/>
+          </w:tcPr>
+          <w:p>
+            <w:r>
+              <w:t>70</w:t>
+            </w:r>
+          </w:p>
+        </w:tc>
+        <w:tc>
+          <w:tcPr>
+            <w:tcW w:type="dxa" w:w="864"/>
+          </w:tcPr>
+          <w:p>
+            <w:r>
+              <w:t>10.1</w:t>
+            </w:r>
+          </w:p>
+        </w:tc>
+        <w:tc>
+          <w:tcPr>
+            <w:tcW w:type="dxa" w:w="864"/>
+          </w:tcPr>
+          <w:p>
+            <w:r>
+              <w:t>10.1</w:t>
+            </w:r>
+          </w:p>
+        </w:tc>
+        <w:tc>
+          <w:tcPr>
+            <w:tcW w:type="dxa" w:w="864"/>
+          </w:tcPr>
+          <w:p>
+            <w:r>
+              <w:t>10.4</w:t>
+            </w:r>
+          </w:p>
+        </w:tc>
+        <w:tc>
+          <w:tcPr>
+            <w:tcW w:type="dxa" w:w="864"/>
+          </w:tcPr>
+          <w:p>
+            <w:r>
+              <w:t>13.4</w:t>
+            </w:r>
+          </w:p>
+        </w:tc>
+        <w:tc>
+          <w:tcPr>
+            <w:tcW w:type="dxa" w:w="864"/>
+          </w:tcPr>
+          <w:p>
+            <w:r>
+              <w:t>20.8</w:t>
+            </w:r>
+          </w:p>
+        </w:tc>
+        <w:tc>
+          <w:tcPr>
+            <w:tcW w:type="dxa" w:w="864"/>
+          </w:tcPr>
+          <w:p>
+            <w:r>
+              <w:t>33.2</w:t>
+            </w:r>
+          </w:p>
+        </w:tc>
+        <w:tc>
+          <w:tcPr>
+            <w:tcW w:type="dxa" w:w="864"/>
+          </w:tcPr>
+          <w:p>
+            <w:r>
+              <w:t>50.0</w:t>
+            </w:r>
+          </w:p>
+        </w:tc>
+      </w:tr>
+      <w:tr>
+        <w:tc>
+          <w:tcPr>
+            <w:tcW w:type="dxa" w:w="864"/>
           </w:tcPr>
           <w:p>
             <w:r>
@@ -551,7 +836,517 @@
         </w:tc>
         <w:tc>
           <w:tcPr>
-            <w:tcW w:type="dxa" w:w="1234"/>
+            <w:tcW w:type="dxa" w:w="864"/>
+          </w:tcPr>
+          <w:p>
+            <w:r>
+              <w:t>20s</w:t>
+            </w:r>
+          </w:p>
+        </w:tc>
+        <w:tc>
+          <w:tcPr>
+            <w:tcW w:type="dxa" w:w="864"/>
+          </w:tcPr>
+          <w:p>
+            <w:r>
+              <w:t>20</w:t>
+            </w:r>
+          </w:p>
+        </w:tc>
+        <w:tc>
+          <w:tcPr>
+            <w:tcW w:type="dxa" w:w="864"/>
+          </w:tcPr>
+          <w:p>
+            <w:r>
+              <w:t>0.0</w:t>
+            </w:r>
+          </w:p>
+        </w:tc>
+        <w:tc>
+          <w:tcPr>
+            <w:tcW w:type="dxa" w:w="864"/>
+          </w:tcPr>
+          <w:p>
+            <w:r>
+              <w:t>0.0</w:t>
+            </w:r>
+          </w:p>
+        </w:tc>
+        <w:tc>
+          <w:tcPr>
+            <w:tcW w:type="dxa" w:w="864"/>
+          </w:tcPr>
+          <w:p>
+            <w:r>
+              <w:t>0.0</w:t>
+            </w:r>
+          </w:p>
+        </w:tc>
+        <w:tc>
+          <w:tcPr>
+            <w:tcW w:type="dxa" w:w="864"/>
+          </w:tcPr>
+          <w:p>
+            <w:r>
+              <w:t>0.0</w:t>
+            </w:r>
+          </w:p>
+        </w:tc>
+        <w:tc>
+          <w:tcPr>
+            <w:tcW w:type="dxa" w:w="864"/>
+          </w:tcPr>
+          <w:p>
+            <w:r>
+              <w:t>0.0</w:t>
+            </w:r>
+          </w:p>
+        </w:tc>
+        <w:tc>
+          <w:tcPr>
+            <w:tcW w:type="dxa" w:w="864"/>
+          </w:tcPr>
+          <w:p>
+            <w:r>
+              <w:t>0.0</w:t>
+            </w:r>
+          </w:p>
+        </w:tc>
+        <w:tc>
+          <w:tcPr>
+            <w:tcW w:type="dxa" w:w="864"/>
+          </w:tcPr>
+          <w:p>
+            <w:r>
+              <w:t>0.0</w:t>
+            </w:r>
+          </w:p>
+        </w:tc>
+      </w:tr>
+      <w:tr>
+        <w:tc>
+          <w:tcPr>
+            <w:tcW w:type="dxa" w:w="864"/>
+          </w:tcPr>
+          <w:p>
+            <w:r>
+              <w:t>女性</w:t>
+            </w:r>
+          </w:p>
+        </w:tc>
+        <w:tc>
+          <w:tcPr>
+            <w:tcW w:type="dxa" w:w="864"/>
+          </w:tcPr>
+          <w:p>
+            <w:r>
+              <w:t>30s</w:t>
+            </w:r>
+          </w:p>
+        </w:tc>
+        <w:tc>
+          <w:tcPr>
+            <w:tcW w:type="dxa" w:w="864"/>
+          </w:tcPr>
+          <w:p>
+            <w:r>
+              <w:t>30</w:t>
+            </w:r>
+          </w:p>
+        </w:tc>
+        <w:tc>
+          <w:tcPr>
+            <w:tcW w:type="dxa" w:w="864"/>
+          </w:tcPr>
+          <w:p>
+            <w:r>
+              <w:t>0.2</w:t>
+            </w:r>
+          </w:p>
+        </w:tc>
+        <w:tc>
+          <w:tcPr>
+            <w:tcW w:type="dxa" w:w="864"/>
+          </w:tcPr>
+          <w:p>
+            <w:r>
+              <w:t>0.2</w:t>
+            </w:r>
+          </w:p>
+        </w:tc>
+        <w:tc>
+          <w:tcPr>
+            <w:tcW w:type="dxa" w:w="864"/>
+          </w:tcPr>
+          <w:p>
+            <w:r>
+              <w:t>0.2</w:t>
+            </w:r>
+          </w:p>
+        </w:tc>
+        <w:tc>
+          <w:tcPr>
+            <w:tcW w:type="dxa" w:w="864"/>
+          </w:tcPr>
+          <w:p>
+            <w:r>
+              <w:t>0.2</w:t>
+            </w:r>
+          </w:p>
+        </w:tc>
+        <w:tc>
+          <w:tcPr>
+            <w:tcW w:type="dxa" w:w="864"/>
+          </w:tcPr>
+          <w:p>
+            <w:r>
+              <w:t>0.3</w:t>
+            </w:r>
+          </w:p>
+        </w:tc>
+        <w:tc>
+          <w:tcPr>
+            <w:tcW w:type="dxa" w:w="864"/>
+          </w:tcPr>
+          <w:p>
+            <w:r>
+              <w:t>0.5</w:t>
+            </w:r>
+          </w:p>
+        </w:tc>
+        <w:tc>
+          <w:tcPr>
+            <w:tcW w:type="dxa" w:w="864"/>
+          </w:tcPr>
+          <w:p>
+            <w:r>
+              <w:t>1.1</w:t>
+            </w:r>
+          </w:p>
+        </w:tc>
+      </w:tr>
+      <w:tr>
+        <w:tc>
+          <w:tcPr>
+            <w:tcW w:type="dxa" w:w="864"/>
+          </w:tcPr>
+          <w:p>
+            <w:r>
+              <w:t>女性</w:t>
+            </w:r>
+          </w:p>
+        </w:tc>
+        <w:tc>
+          <w:tcPr>
+            <w:tcW w:type="dxa" w:w="864"/>
+          </w:tcPr>
+          <w:p>
+            <w:r>
+              <w:t>40s</w:t>
+            </w:r>
+          </w:p>
+        </w:tc>
+        <w:tc>
+          <w:tcPr>
+            <w:tcW w:type="dxa" w:w="864"/>
+          </w:tcPr>
+          <w:p>
+            <w:r>
+              <w:t>40</w:t>
+            </w:r>
+          </w:p>
+        </w:tc>
+        <w:tc>
+          <w:tcPr>
+            <w:tcW w:type="dxa" w:w="864"/>
+          </w:tcPr>
+          <w:p>
+            <w:r>
+              <w:t>1.1</w:t>
+            </w:r>
+          </w:p>
+        </w:tc>
+        <w:tc>
+          <w:tcPr>
+            <w:tcW w:type="dxa" w:w="864"/>
+          </w:tcPr>
+          <w:p>
+            <w:r>
+              <w:t>1.1</w:t>
+            </w:r>
+          </w:p>
+        </w:tc>
+        <w:tc>
+          <w:tcPr>
+            <w:tcW w:type="dxa" w:w="864"/>
+          </w:tcPr>
+          <w:p>
+            <w:r>
+              <w:t>1.1</w:t>
+            </w:r>
+          </w:p>
+        </w:tc>
+        <w:tc>
+          <w:tcPr>
+            <w:tcW w:type="dxa" w:w="864"/>
+          </w:tcPr>
+          <w:p>
+            <w:r>
+              <w:t>1.3</w:t>
+            </w:r>
+          </w:p>
+        </w:tc>
+        <w:tc>
+          <w:tcPr>
+            <w:tcW w:type="dxa" w:w="864"/>
+          </w:tcPr>
+          <w:p>
+            <w:r>
+              <w:t>1.7</w:t>
+            </w:r>
+          </w:p>
+        </w:tc>
+        <w:tc>
+          <w:tcPr>
+            <w:tcW w:type="dxa" w:w="864"/>
+          </w:tcPr>
+          <w:p>
+            <w:r>
+              <w:t>2.7</w:t>
+            </w:r>
+          </w:p>
+        </w:tc>
+        <w:tc>
+          <w:tcPr>
+            <w:tcW w:type="dxa" w:w="864"/>
+          </w:tcPr>
+          <w:p>
+            <w:r>
+              <w:t>4.8</w:t>
+            </w:r>
+          </w:p>
+        </w:tc>
+      </w:tr>
+      <w:tr>
+        <w:tc>
+          <w:tcPr>
+            <w:tcW w:type="dxa" w:w="864"/>
+          </w:tcPr>
+          <w:p>
+            <w:r>
+              <w:t>女性</w:t>
+            </w:r>
+          </w:p>
+        </w:tc>
+        <w:tc>
+          <w:tcPr>
+            <w:tcW w:type="dxa" w:w="864"/>
+          </w:tcPr>
+          <w:p>
+            <w:r>
+              <w:t>50s</w:t>
+            </w:r>
+          </w:p>
+        </w:tc>
+        <w:tc>
+          <w:tcPr>
+            <w:tcW w:type="dxa" w:w="864"/>
+          </w:tcPr>
+          <w:p>
+            <w:r>
+              <w:t>50</w:t>
+            </w:r>
+          </w:p>
+        </w:tc>
+        <w:tc>
+          <w:tcPr>
+            <w:tcW w:type="dxa" w:w="864"/>
+          </w:tcPr>
+          <w:p>
+            <w:r>
+              <w:t>2.9</w:t>
+            </w:r>
+          </w:p>
+        </w:tc>
+        <w:tc>
+          <w:tcPr>
+            <w:tcW w:type="dxa" w:w="864"/>
+          </w:tcPr>
+          <w:p>
+            <w:r>
+              <w:t>2.9</w:t>
+            </w:r>
+          </w:p>
+        </w:tc>
+        <w:tc>
+          <w:tcPr>
+            <w:tcW w:type="dxa" w:w="864"/>
+          </w:tcPr>
+          <w:p>
+            <w:r>
+              <w:t>3.1</w:t>
+            </w:r>
+          </w:p>
+        </w:tc>
+        <w:tc>
+          <w:tcPr>
+            <w:tcW w:type="dxa" w:w="864"/>
+          </w:tcPr>
+          <w:p>
+            <w:r>
+              <w:t>3.7</w:t>
+            </w:r>
+          </w:p>
+        </w:tc>
+        <w:tc>
+          <w:tcPr>
+            <w:tcW w:type="dxa" w:w="864"/>
+          </w:tcPr>
+          <w:p>
+            <w:r>
+              <w:t>5.0</w:t>
+            </w:r>
+          </w:p>
+        </w:tc>
+        <w:tc>
+          <w:tcPr>
+            <w:tcW w:type="dxa" w:w="864"/>
+          </w:tcPr>
+          <w:p>
+            <w:r>
+              <w:t>7.4</w:t>
+            </w:r>
+          </w:p>
+        </w:tc>
+        <w:tc>
+          <w:tcPr>
+            <w:tcW w:type="dxa" w:w="864"/>
+          </w:tcPr>
+          <w:p>
+            <w:r>
+              <w:t>11.9</w:t>
+            </w:r>
+          </w:p>
+        </w:tc>
+      </w:tr>
+      <w:tr>
+        <w:tc>
+          <w:tcPr>
+            <w:tcW w:type="dxa" w:w="864"/>
+          </w:tcPr>
+          <w:p>
+            <w:r>
+              <w:t>女性</w:t>
+            </w:r>
+          </w:p>
+        </w:tc>
+        <w:tc>
+          <w:tcPr>
+            <w:tcW w:type="dxa" w:w="864"/>
+          </w:tcPr>
+          <w:p>
+            <w:r>
+              <w:t>60s</w:t>
+            </w:r>
+          </w:p>
+        </w:tc>
+        <w:tc>
+          <w:tcPr>
+            <w:tcW w:type="dxa" w:w="864"/>
+          </w:tcPr>
+          <w:p>
+            <w:r>
+              <w:t>60</w:t>
+            </w:r>
+          </w:p>
+        </w:tc>
+        <w:tc>
+          <w:tcPr>
+            <w:tcW w:type="dxa" w:w="864"/>
+          </w:tcPr>
+          <w:p>
+            <w:r>
+              <w:t>5.9</w:t>
+            </w:r>
+          </w:p>
+        </w:tc>
+        <w:tc>
+          <w:tcPr>
+            <w:tcW w:type="dxa" w:w="864"/>
+          </w:tcPr>
+          <w:p>
+            <w:r>
+              <w:t>5.9</w:t>
+            </w:r>
+          </w:p>
+        </w:tc>
+        <w:tc>
+          <w:tcPr>
+            <w:tcW w:type="dxa" w:w="864"/>
+          </w:tcPr>
+          <w:p>
+            <w:r>
+              <w:t>6.5</w:t>
+            </w:r>
+          </w:p>
+        </w:tc>
+        <w:tc>
+          <w:tcPr>
+            <w:tcW w:type="dxa" w:w="864"/>
+          </w:tcPr>
+          <w:p>
+            <w:r>
+              <w:t>7.9</w:t>
+            </w:r>
+          </w:p>
+        </w:tc>
+        <w:tc>
+          <w:tcPr>
+            <w:tcW w:type="dxa" w:w="864"/>
+          </w:tcPr>
+          <w:p>
+            <w:r>
+              <w:t>10.6</w:t>
+            </w:r>
+          </w:p>
+        </w:tc>
+        <w:tc>
+          <w:tcPr>
+            <w:tcW w:type="dxa" w:w="864"/>
+          </w:tcPr>
+          <w:p>
+            <w:r>
+              <w:t>15.3</w:t>
+            </w:r>
+          </w:p>
+        </w:tc>
+        <w:tc>
+          <w:tcPr>
+            <w:tcW w:type="dxa" w:w="864"/>
+          </w:tcPr>
+          <w:p>
+            <w:r>
+              <w:t>23.0</w:t>
+            </w:r>
+          </w:p>
+        </w:tc>
+      </w:tr>
+      <w:tr>
+        <w:tc>
+          <w:tcPr>
+            <w:tcW w:type="dxa" w:w="864"/>
+          </w:tcPr>
+          <w:p>
+            <w:r>
+              <w:t>女性</w:t>
+            </w:r>
+          </w:p>
+        </w:tc>
+        <w:tc>
+          <w:tcPr>
+            <w:tcW w:type="dxa" w:w="864"/>
           </w:tcPr>
           <w:p>
             <w:r>
@@ -561,7 +1356,37 @@
         </w:tc>
         <w:tc>
           <w:tcPr>
-            <w:tcW w:type="dxa" w:w="1234"/>
+            <w:tcW w:type="dxa" w:w="864"/>
+          </w:tcPr>
+          <w:p>
+            <w:r>
+              <w:t>70</w:t>
+            </w:r>
+          </w:p>
+        </w:tc>
+        <w:tc>
+          <w:tcPr>
+            <w:tcW w:type="dxa" w:w="864"/>
+          </w:tcPr>
+          <w:p>
+            <w:r>
+              <w:t>10.2</w:t>
+            </w:r>
+          </w:p>
+        </w:tc>
+        <w:tc>
+          <w:tcPr>
+            <w:tcW w:type="dxa" w:w="864"/>
+          </w:tcPr>
+          <w:p>
+            <w:r>
+              <w:t>10.2</w:t>
+            </w:r>
+          </w:p>
+        </w:tc>
+        <w:tc>
+          <w:tcPr>
+            <w:tcW w:type="dxa" w:w="864"/>
           </w:tcPr>
           <w:p>
             <w:r>
@@ -571,7 +1396,7 @@
         </w:tc>
         <w:tc>
           <w:tcPr>
-            <w:tcW w:type="dxa" w:w="1234"/>
+            <w:tcW w:type="dxa" w:w="864"/>
           </w:tcPr>
           <w:p>
             <w:r>
@@ -581,7 +1406,7 @@
         </w:tc>
         <w:tc>
           <w:tcPr>
-            <w:tcW w:type="dxa" w:w="1234"/>
+            <w:tcW w:type="dxa" w:w="864"/>
           </w:tcPr>
           <w:p>
             <w:r>
@@ -591,7 +1416,7 @@
         </w:tc>
         <w:tc>
           <w:tcPr>
-            <w:tcW w:type="dxa" w:w="1234"/>
+            <w:tcW w:type="dxa" w:w="864"/>
           </w:tcPr>
           <w:p>
             <w:r>
@@ -601,7 +1426,7 @@
         </w:tc>
         <w:tc>
           <w:tcPr>
-            <w:tcW w:type="dxa" w:w="1234"/>
+            <w:tcW w:type="dxa" w:w="864"/>
           </w:tcPr>
           <w:p>
             <w:r>
@@ -611,6 +1436,11 @@
         </w:tc>
       </w:tr>
     </w:tbl>
+    <w:p>
+      <w:r>
+        <w:t>注：0.125 kHz列は実装どおり0.25 kHz参照の流用値である。</w:t>
+      </w:r>
+    </w:p>
     <w:p>
       <w:pPr>
         <w:pStyle w:val="Heading2"/>
@@ -1660,7 +2490,7 @@
           </w:tcPr>
           <w:p>
             <w:r>
-              <w:t>SNHL_Age:60/60; SNHL_NoiseNotch:60/60; SNHL_Meniere:60/60; SNHL_Sudden:60/60; SNHL_Mumps:60/60; CHL_OME:60/60; CHL_AOM:6</w:t>
+              <w:t>9プロファイル各60/60（計540）。内訳は表下の注を参照。</w:t>
             </w:r>
           </w:p>
         </w:tc>
@@ -2100,7 +2930,11 @@
         </w:tc>
       </w:tr>
     </w:tbl>
-    <w:p/>
+    <w:p>
+      <w:r>
+        <w:t>T8のプロファイル別内訳（各60セル）：SNHL_Age:60/60; SNHL_NoiseNotch:60/60; SNHL_Meniere:60/60; SNHL_Sudden:60/60; SNHL_Mumps:60/60; CHL_OME:60/60; CHL_AOM:60/60; CHL_Otosclerosis:60/60; CHL_OssicularDiscontinuity:60/60</w:t>
+      </w:r>
+    </w:p>
     <w:p>
       <w:pPr>
         <w:pStyle w:val="Heading3"/>
@@ -2602,7 +3436,7 @@
     </w:p>
     <w:p>
       <w:r>
-        <w:t>・床規則の別掲（全周SOを除く）：突発一側差 694/694、突発程度3 214/214、ムンプス 366/366、ムンプス（0.5/1/2 kHzにSOなし） 366/366。主合否の720/720はSOを含めた評価である。</w:t>
+        <w:t>・床規則の別掲（全周SOを除く）：突発一側差 694/694、突発程度3 214/214、ムンプス 366/366。「0.5/1/2 kHzにSOなし」で再集計しても同数となるが、全周SO以外では当該3周波にSOが生じない構造上、両定義が一致するためである（重複計上ではない）。主合否の720/720はSOを含めた評価である。</w:t>
       </w:r>
     </w:p>
     <w:p>

</xml_diff>

<commit_message>
Finalize v2.32 pre-submission wording and sync EN abstract.
Shorten the Japanese abstract, align the English abstract, document G4 as independently defined limits, add AC/BC limit tables, and clarify SO, mutation ID gaps, and sex in generation checks.

Co-authored-by: Cursor <cursoragent@cursor.com>
</commit_message>
<xml_diff>
--- a/docs/pilot-study/manuscripts/Supplement1_verification.docx
+++ b/docs/pilot-study/manuscripts/Supplement1_verification.docx
@@ -50,7 +50,7 @@
     </w:p>
     <w:p>
       <w:r>
-        <w:t>・検証スクリプトは生成プログラムとは別ファイルに判定関数を実装した。症例生成のため生成関数を呼び出すが、合否判定式は生成器内部の拘束ルーチンを共有しない。一部の定数（最小ABG床など）は双方に同値を重複定義し、凍結正解表と突合して管理した。同一著者・同一仕様に基づく確認であり、外部機関による第三者検証ではない。</w:t>
+        <w:t>・検証スクリプトは生成プログラムとは別ファイル（scripts/lib/audiogramRuleChecks.mjs）に判定関数を実装した。症例生成のため生成関数を呼び出すが、合否判定式は生成器内部の拘束ルーチンを共有しない。一部の定数（最小ABG床・周波数別上下限など）は双方に同値を重複定義し、凍結正解表と突合して管理した。周波数別上下限（G4a／G4b）は生成器のEngineConstantsを参照せず、検証側に別定義した上下限表と比較する（値は生成器LIMITSおよびRULE_SPEC P4と同値）。同一著者・同一仕様に基づく確認であり、外部機関による第三者検証ではない。</w:t>
       </w:r>
     </w:p>
     <w:p>
@@ -88,7 +88,7 @@
     </w:p>
     <w:p>
       <w:r>
-        <w:t>規格本文の表は転載しない。実装した教育用JSONの気導中央値（dB HL）を示す。各年齢群の代表年齢は、ISO 7029:2017の式に代入した年齢として 20歳代＝20歳、30歳代＝30歳、40歳代＝40歳、50歳代＝50歳、60歳代＝60歳、70歳代＝70歳 （各群の下限年齢）とした。ISO 7029:2017の係数表は125 Hzならびに1.5・3・6 kHzを含む。本システムの生成周波数は0.125・0.25・0.5・1・2・4・8 kHzであり、1.5・3・6 kHzは未実装である。0.125 kHzはISO係数表に含まれるが、現行の参照JSONには0.25–8 kHzのみを格納しているため、実装上は0.25 kHzの参照値を流用し、周波数別の教育用上下限で拘束している（規格値の隣接帯補間ではない）。骨導基準はISOが直接規定するものではなく、気骨導関係の著者規則から生成する。</w:t>
+        <w:t>規格本文の表は転載しない。実装した教育用JSONの気導中央値（dB HL）を示す。各年齢群の代表年齢は、ISO 7029:2017の式に代入した年齢として 20歳代＝20歳、30歳代＝30歳、40歳代＝40歳、50歳代＝50歳、60歳代＝60歳、70歳代＝70歳（各群の下限年齢）とした。ばらつき指標は、同JSONのminus2SD／plus2SD（ISO由来の±2SD相当帯）である。生成時は中央値を平均、帯域幅から近似したSDで正規乱数サンプリングし、帯域内にクリップしたうえで5 dB丸めと周波数別上下限を適用する。本文の「概ね±5～10 dB」はこの教育用サンプリングの要約であり、ISOのsu／sl式そのものの実装ではない。ISO 7029:2017の係数表は125 Hzならびに1.5・3・6 kHzを含む。本システムの生成周波数は0.125・0.25・0.5・1・2・4・8 kHzであり、1.5・3・6 kHzは未実装である。0.125 kHzはISO係数表に含まれるが、現行の参照JSONには0.25–8 kHzのみを格納しているため、実装上は0.25 kHzの参照値を流用し、周波数別の教育用上下限で拘束している（規格値の隣接帯補間ではない）。骨導基準はISOが直接規定するものではなく、気骨導関係の著者規則から生成する。</w:t>
       </w:r>
     </w:p>
     <w:tbl>
@@ -1439,6 +1439,454 @@
     <w:p>
       <w:r>
         <w:t>注：0.125 kHz列は実装どおり0.25 kHz参照の流用値である。</w:t>
+      </w:r>
+    </w:p>
+    <w:p>
+      <w:pPr>
+        <w:pStyle w:val="Heading2"/>
+      </w:pPr>
+      <w:r>
+        <w:t>1c．教育用周波数別上下限（凍結・G4判定に使用）</w:t>
+      </w:r>
+    </w:p>
+    <w:p>
+      <w:r>
+        <w:t>以下は凍結正解表（RULE_SPEC P4）および検証側LIMITSと同値である。生成器側にも同値のLIMITSがあるが、G4a／G4bは生成器のEngineConstantsを参照せず、検証側の別定義表と比較する。</w:t>
+      </w:r>
+    </w:p>
+    <w:tbl>
+      <w:tblPr>
+        <w:tblStyle w:val="TableGrid"/>
+        <w:tblW w:type="auto" w:w="0"/>
+        <w:tblLook w:firstColumn="1" w:firstRow="1" w:lastColumn="0" w:lastRow="0" w:noHBand="0" w:noVBand="1" w:val="04A0"/>
+      </w:tblPr>
+      <w:tblGrid>
+        <w:gridCol w:w="1728"/>
+        <w:gridCol w:w="1728"/>
+        <w:gridCol w:w="1728"/>
+        <w:gridCol w:w="1728"/>
+        <w:gridCol w:w="1728"/>
+      </w:tblGrid>
+      <w:tr>
+        <w:tc>
+          <w:tcPr>
+            <w:tcW w:type="dxa" w:w="1728"/>
+          </w:tcPr>
+          <w:p>
+            <w:r>
+              <w:t>周波数</w:t>
+            </w:r>
+          </w:p>
+        </w:tc>
+        <w:tc>
+          <w:tcPr>
+            <w:tcW w:type="dxa" w:w="1728"/>
+          </w:tcPr>
+          <w:p>
+            <w:r>
+              <w:t>気導下限</w:t>
+            </w:r>
+          </w:p>
+        </w:tc>
+        <w:tc>
+          <w:tcPr>
+            <w:tcW w:type="dxa" w:w="1728"/>
+          </w:tcPr>
+          <w:p>
+            <w:r>
+              <w:t>気導上限</w:t>
+            </w:r>
+          </w:p>
+        </w:tc>
+        <w:tc>
+          <w:tcPr>
+            <w:tcW w:type="dxa" w:w="1728"/>
+          </w:tcPr>
+          <w:p>
+            <w:r>
+              <w:t>骨導下限</w:t>
+            </w:r>
+          </w:p>
+        </w:tc>
+        <w:tc>
+          <w:tcPr>
+            <w:tcW w:type="dxa" w:w="1728"/>
+          </w:tcPr>
+          <w:p>
+            <w:r>
+              <w:t>骨導上限</w:t>
+            </w:r>
+          </w:p>
+        </w:tc>
+      </w:tr>
+      <w:tr>
+        <w:tc>
+          <w:tcPr>
+            <w:tcW w:type="dxa" w:w="1728"/>
+          </w:tcPr>
+          <w:p>
+            <w:r>
+              <w:t>0.125 kHz</w:t>
+            </w:r>
+          </w:p>
+        </w:tc>
+        <w:tc>
+          <w:tcPr>
+            <w:tcW w:type="dxa" w:w="1728"/>
+          </w:tcPr>
+          <w:p>
+            <w:r>
+              <w:t>5</w:t>
+            </w:r>
+          </w:p>
+        </w:tc>
+        <w:tc>
+          <w:tcPr>
+            <w:tcW w:type="dxa" w:w="1728"/>
+          </w:tcPr>
+          <w:p>
+            <w:r>
+              <w:t>70</w:t>
+            </w:r>
+          </w:p>
+        </w:tc>
+        <w:tc>
+          <w:tcPr>
+            <w:tcW w:type="dxa" w:w="1728"/>
+          </w:tcPr>
+          <w:p>
+            <w:r>
+              <w:t>—</w:t>
+            </w:r>
+          </w:p>
+        </w:tc>
+        <w:tc>
+          <w:tcPr>
+            <w:tcW w:type="dxa" w:w="1728"/>
+          </w:tcPr>
+          <w:p>
+            <w:r>
+              <w:t>—</w:t>
+            </w:r>
+          </w:p>
+        </w:tc>
+      </w:tr>
+      <w:tr>
+        <w:tc>
+          <w:tcPr>
+            <w:tcW w:type="dxa" w:w="1728"/>
+          </w:tcPr>
+          <w:p>
+            <w:r>
+              <w:t>0.25 kHz</w:t>
+            </w:r>
+          </w:p>
+        </w:tc>
+        <w:tc>
+          <w:tcPr>
+            <w:tcW w:type="dxa" w:w="1728"/>
+          </w:tcPr>
+          <w:p>
+            <w:r>
+              <w:t>5</w:t>
+            </w:r>
+          </w:p>
+        </w:tc>
+        <w:tc>
+          <w:tcPr>
+            <w:tcW w:type="dxa" w:w="1728"/>
+          </w:tcPr>
+          <w:p>
+            <w:r>
+              <w:t>90</w:t>
+            </w:r>
+          </w:p>
+        </w:tc>
+        <w:tc>
+          <w:tcPr>
+            <w:tcW w:type="dxa" w:w="1728"/>
+          </w:tcPr>
+          <w:p>
+            <w:r>
+              <w:t>5</w:t>
+            </w:r>
+          </w:p>
+        </w:tc>
+        <w:tc>
+          <w:tcPr>
+            <w:tcW w:type="dxa" w:w="1728"/>
+          </w:tcPr>
+          <w:p>
+            <w:r>
+              <w:t>60</w:t>
+            </w:r>
+          </w:p>
+        </w:tc>
+      </w:tr>
+      <w:tr>
+        <w:tc>
+          <w:tcPr>
+            <w:tcW w:type="dxa" w:w="1728"/>
+          </w:tcPr>
+          <w:p>
+            <w:r>
+              <w:t>0.5 kHz</w:t>
+            </w:r>
+          </w:p>
+        </w:tc>
+        <w:tc>
+          <w:tcPr>
+            <w:tcW w:type="dxa" w:w="1728"/>
+          </w:tcPr>
+          <w:p>
+            <w:r>
+              <w:t>5</w:t>
+            </w:r>
+          </w:p>
+        </w:tc>
+        <w:tc>
+          <w:tcPr>
+            <w:tcW w:type="dxa" w:w="1728"/>
+          </w:tcPr>
+          <w:p>
+            <w:r>
+              <w:t>110</w:t>
+            </w:r>
+          </w:p>
+        </w:tc>
+        <w:tc>
+          <w:tcPr>
+            <w:tcW w:type="dxa" w:w="1728"/>
+          </w:tcPr>
+          <w:p>
+            <w:r>
+              <w:t>5</w:t>
+            </w:r>
+          </w:p>
+        </w:tc>
+        <w:tc>
+          <w:tcPr>
+            <w:tcW w:type="dxa" w:w="1728"/>
+          </w:tcPr>
+          <w:p>
+            <w:r>
+              <w:t>65</w:t>
+            </w:r>
+          </w:p>
+        </w:tc>
+      </w:tr>
+      <w:tr>
+        <w:tc>
+          <w:tcPr>
+            <w:tcW w:type="dxa" w:w="1728"/>
+          </w:tcPr>
+          <w:p>
+            <w:r>
+              <w:t>1 kHz</w:t>
+            </w:r>
+          </w:p>
+        </w:tc>
+        <w:tc>
+          <w:tcPr>
+            <w:tcW w:type="dxa" w:w="1728"/>
+          </w:tcPr>
+          <w:p>
+            <w:r>
+              <w:t>0</w:t>
+            </w:r>
+          </w:p>
+        </w:tc>
+        <w:tc>
+          <w:tcPr>
+            <w:tcW w:type="dxa" w:w="1728"/>
+          </w:tcPr>
+          <w:p>
+            <w:r>
+              <w:t>110</w:t>
+            </w:r>
+          </w:p>
+        </w:tc>
+        <w:tc>
+          <w:tcPr>
+            <w:tcW w:type="dxa" w:w="1728"/>
+          </w:tcPr>
+          <w:p>
+            <w:r>
+              <w:t>0</w:t>
+            </w:r>
+          </w:p>
+        </w:tc>
+        <w:tc>
+          <w:tcPr>
+            <w:tcW w:type="dxa" w:w="1728"/>
+          </w:tcPr>
+          <w:p>
+            <w:r>
+              <w:t>70</w:t>
+            </w:r>
+          </w:p>
+        </w:tc>
+      </w:tr>
+      <w:tr>
+        <w:tc>
+          <w:tcPr>
+            <w:tcW w:type="dxa" w:w="1728"/>
+          </w:tcPr>
+          <w:p>
+            <w:r>
+              <w:t>2 kHz</w:t>
+            </w:r>
+          </w:p>
+        </w:tc>
+        <w:tc>
+          <w:tcPr>
+            <w:tcW w:type="dxa" w:w="1728"/>
+          </w:tcPr>
+          <w:p>
+            <w:r>
+              <w:t>0</w:t>
+            </w:r>
+          </w:p>
+        </w:tc>
+        <w:tc>
+          <w:tcPr>
+            <w:tcW w:type="dxa" w:w="1728"/>
+          </w:tcPr>
+          <w:p>
+            <w:r>
+              <w:t>110</w:t>
+            </w:r>
+          </w:p>
+        </w:tc>
+        <w:tc>
+          <w:tcPr>
+            <w:tcW w:type="dxa" w:w="1728"/>
+          </w:tcPr>
+          <w:p>
+            <w:r>
+              <w:t>0</w:t>
+            </w:r>
+          </w:p>
+        </w:tc>
+        <w:tc>
+          <w:tcPr>
+            <w:tcW w:type="dxa" w:w="1728"/>
+          </w:tcPr>
+          <w:p>
+            <w:r>
+              <w:t>70</w:t>
+            </w:r>
+          </w:p>
+        </w:tc>
+      </w:tr>
+      <w:tr>
+        <w:tc>
+          <w:tcPr>
+            <w:tcW w:type="dxa" w:w="1728"/>
+          </w:tcPr>
+          <w:p>
+            <w:r>
+              <w:t>4 kHz</w:t>
+            </w:r>
+          </w:p>
+        </w:tc>
+        <w:tc>
+          <w:tcPr>
+            <w:tcW w:type="dxa" w:w="1728"/>
+          </w:tcPr>
+          <w:p>
+            <w:r>
+              <w:t>-5</w:t>
+            </w:r>
+          </w:p>
+        </w:tc>
+        <w:tc>
+          <w:tcPr>
+            <w:tcW w:type="dxa" w:w="1728"/>
+          </w:tcPr>
+          <w:p>
+            <w:r>
+              <w:t>110</w:t>
+            </w:r>
+          </w:p>
+        </w:tc>
+        <w:tc>
+          <w:tcPr>
+            <w:tcW w:type="dxa" w:w="1728"/>
+          </w:tcPr>
+          <w:p>
+            <w:r>
+              <w:t>-5</w:t>
+            </w:r>
+          </w:p>
+        </w:tc>
+        <w:tc>
+          <w:tcPr>
+            <w:tcW w:type="dxa" w:w="1728"/>
+          </w:tcPr>
+          <w:p>
+            <w:r>
+              <w:t>65</w:t>
+            </w:r>
+          </w:p>
+        </w:tc>
+      </w:tr>
+      <w:tr>
+        <w:tc>
+          <w:tcPr>
+            <w:tcW w:type="dxa" w:w="1728"/>
+          </w:tcPr>
+          <w:p>
+            <w:r>
+              <w:t>8 kHz</w:t>
+            </w:r>
+          </w:p>
+        </w:tc>
+        <w:tc>
+          <w:tcPr>
+            <w:tcW w:type="dxa" w:w="1728"/>
+          </w:tcPr>
+          <w:p>
+            <w:r>
+              <w:t>-5</w:t>
+            </w:r>
+          </w:p>
+        </w:tc>
+        <w:tc>
+          <w:tcPr>
+            <w:tcW w:type="dxa" w:w="1728"/>
+          </w:tcPr>
+          <w:p>
+            <w:r>
+              <w:t>100</w:t>
+            </w:r>
+          </w:p>
+        </w:tc>
+        <w:tc>
+          <w:tcPr>
+            <w:tcW w:type="dxa" w:w="1728"/>
+          </w:tcPr>
+          <w:p>
+            <w:r>
+              <w:t>—</w:t>
+            </w:r>
+          </w:p>
+        </w:tc>
+        <w:tc>
+          <w:tcPr>
+            <w:tcW w:type="dxa" w:w="1728"/>
+          </w:tcPr>
+          <w:p>
+            <w:r>
+              <w:t>—</w:t>
+            </w:r>
+          </w:p>
+        </w:tc>
+      </w:tr>
+    </w:tbl>
+    <w:p>
+      <w:r>
+        <w:t>注：境界値（下限または上限との一致）は適合。範囲外は不適合。単位は dB HL。</w:t>
       </w:r>
     </w:p>
     <w:p>
@@ -1643,7 +2091,9 @@
             <w:tcW w:type="dxa" w:w="1440"/>
           </w:tcPr>
           <w:p>
-            <w:r/>
+            <w:r>
+              <w:t>年齢・性別・パターン・程度の反映</w:t>
+            </w:r>
           </w:p>
         </w:tc>
       </w:tr>
@@ -3333,17 +3783,17 @@
     </w:p>
     <w:p>
       <w:r>
-        <w:t>・Carhart様の深さ：BC 2 kHz − mean(BC 1 kHz, BC 4 kHz)（付与例）。深さ床は5 dB（識別可能な最小切痕としての著者設定）。</w:t>
+        <w:t>・Carhart様の深さ：BC 2 kHz − mean(BC 1 kHz, BC 4 kHz)（付与例）。深さ床は5 dB。</w:t>
       </w:r>
     </w:p>
     <w:p>
       <w:r>
-        <w:t>・伝音ABG：病側・骨導測定周波数（0.25–4 kHz）ごとの気導−骨導。記述統計の集計には規則の対象外周波数も含む。対象外周波数では教育用に骨導≤気導＋5 dBを許容するため、ABGとして−5 dBが観測されうる。</w:t>
+        <w:t>・伝音ABG：病側・骨導測定周波数（0.25–4 kHz）ごとの気導−骨導。対象外周波数では教育用に骨導≤気導＋5 dBを許容するため、ABGとして−5 dBが観測されうる。</w:t>
       </w:r>
     </w:p>
     <w:p>
       <w:r>
-        <w:t>・スケールアウト（SO）：当該周波数の教育用気導上限値を数値として保持しSOフラグを付す。上限＋5 dB等の外挿代入は行わない。一側差・平均の算出はこの数値を用いる。</w:t>
+        <w:t>・スケールアウト（SO）：気導SOは当該周波数の教育用気導上限値を数値として保持しSOフラグ（soAC）を付す。骨導SOも実装しており、感音難聴のNR規則に基づく周波数別閾値を数値として保持しsoBCフラグを付す。いずれも上限＋5 dB等の外挿代入は行わない。一側差・病側平均の算出は気導数値を用いる。</w:t>
       </w:r>
     </w:p>
     <w:p>
@@ -3356,7 +3806,7 @@
     </w:p>
     <w:p>
       <w:r>
-        <w:t>・伝音ABG（病側・骨導周波数・一括）：n=19200、中央値15.0 dB（四分位範囲10.0–25.0、範囲-5.0–50.0）。※規則の対象外周波数も含むため最小値に−5 dBが観測された。規則指定周波数では所定の最小ABGを満たした。</w:t>
+        <w:t>・伝音ABG（病側・骨導周波数・一括）：n=19200、中央値15.0 dB（四分位範囲10.0–25.0、範囲-5.0–50.0）。</w:t>
       </w:r>
     </w:p>
     <w:p>
@@ -3386,17 +3836,7 @@
     </w:p>
     <w:p>
       <w:r>
-        <w:t>・C5-dipの深さ（4 kHz−2 kHz気導、程度≥1）：n=720、中央値25.0 dB（四分位範囲20.0–30.0、範囲10.0–65.0）</w:t>
-      </w:r>
-    </w:p>
-    <w:p>
-      <w:r>
-        <w:t>・C5-dipの深さ（4 kHz−8 kHz気導、程度≥1）：n=720、中央値15.0 dB（四分位範囲10.0–20.0、範囲10.0–45.0）</w:t>
-      </w:r>
-    </w:p>
-    <w:p>
-      <w:r>
-        <w:t>・C5-dipの深さ（min(4k−2k, 4k−8k)、程度≥1）：n=720、中央値15.0 dB（四分位範囲10.0–20.0、範囲10.0–35.0）</w:t>
+        <w:t>・C5-dipの深さ（4 kHz−2 kHz／4 kHz−8 kHz／min、程度≥1）：n=720、中央値25.0 dB（四分位範囲20.0–30.0、範囲10.0–65.0）／n=720、中央値15.0 dB（四分位範囲10.0–20.0、範囲10.0–45.0）／n=720、中央値15.0 dB（四分位範囲10.0–20.0、範囲10.0–35.0）</w:t>
       </w:r>
     </w:p>
     <w:p>
@@ -3406,27 +3846,17 @@
     </w:p>
     <w:p>
       <w:r>
-        <w:t>・一側差 Sudden（程度≥1全体）：n=720、中央値51.7 dB（四分位範囲40.0–70.0、範囲30.0–108.3）</w:t>
+        <w:t>・一側差 Sudden 程度1／2／3：中央値36.7／51.7／73.3 dB（各n=240）。</w:t>
       </w:r>
     </w:p>
     <w:p>
       <w:r>
-        <w:t>・一側差 Sudden 程度1／2／3：中央値36.7／51.7／73.3 dB（各n=240）。程度≥1は全例≥30 dB。</w:t>
+        <w:t>・一側差 Mumps 程度1／2／3：中央値89.2／90.0／96.7 dB（各n=240）。</w:t>
       </w:r>
     </w:p>
     <w:p>
       <w:r>
-        <w:t>・一側差 Mumps（程度≥1全体）：n=720、中央値95.0 dB（四分位範囲86.7–106.7、範囲78.3–108.3）</w:t>
-      </w:r>
-    </w:p>
-    <w:p>
-      <w:r>
-        <w:t>・一側差 Mumps 程度1／2／3：中央値89.2／90.0／96.7 dB（各n=240）。程度次元は高度床によりほぼ縮退している。</w:t>
-      </w:r>
-    </w:p>
-    <w:p>
-      <w:r>
-        <w:t>・Sudden SO（程度≥1）：なし555件、高音域のみ139件、全周26件。程度2では高音域のみ51件・全周0件、程度3では高音域のみ88件・全周26件。</w:t>
+        <w:t>・Sudden SO（程度≥1）：なし555件、高音域のみ139件、全周26件。</w:t>
       </w:r>
     </w:p>
     <w:p>
@@ -3436,17 +3866,7 @@
     </w:p>
     <w:p>
       <w:r>
-        <w:t>・床規則の別掲（全周SOを除く）：突発一側差 694/694、突発程度3 214/214、ムンプス 366/366。「0.5/1/2 kHzにSOなし」で再集計しても同数となるが、全周SO以外では当該3周波にSOが生じない構造上、両定義が一致するためである（重複計上ではない）。主合否の720/720はSOを含めた評価である。</w:t>
-      </w:r>
-    </w:p>
-    <w:p>
-      <w:r>
-        <w:t>・Carhart様変化：グリッド576/720（80.0%）。T6a/T6bは同じ200件（中等度）。</w:t>
-      </w:r>
-    </w:p>
-    <w:p>
-      <w:r>
-        <w:t>・AOM混合型：グリッド361/720（50.1%）。T6c/T6dは同じ200件（中等度）。</w:t>
+        <w:t>・床規則の別掲（全周SOを除く）：突発一側差 694/694、突発程度3 214/214、ムンプス 366/366。「0.5/1/2 kHzにSOなし」再集計も同数となるが、全周SO以外では当該3周波にSOが生じない構造上一致するためである。</w:t>
       </w:r>
     </w:p>
     <w:p>
@@ -3459,7 +3879,7 @@
     </w:p>
     <w:p>
       <w:r>
-        <w:t>正常・適合データ13項目と規則違反データ18項目の計31項目。規則違反18件はすべて不適合と判定された。生成プログラム本体の改変ではなく、正常生成結果または合成閾値に意図的変更を加えて検証スクリプトへ入力した。</w:t>
+        <w:t>正常・適合データ13項目と規則違反データ18項目の計31項目。規則違反18件はすべて不適合と判定された。識別子は歴史的経緯からM1–M20を用いるが、欠番はM9・M11である（振り直しは行っていない）。</w:t>
       </w:r>
     </w:p>
     <w:tbl>
@@ -3544,7 +3964,7 @@
           </w:tcPr>
           <w:p>
             <w:r>
-              <w:t>M3</w:t>
+              <w:t>M1</w:t>
             </w:r>
           </w:p>
         </w:tc>
@@ -3554,7 +3974,7 @@
           </w:tcPr>
           <w:p>
             <w:r>
-              <w:t>5 dB刻みを外した43 dB</w:t>
+              <w:t>騒音性難聴でC5-dip消失</w:t>
             </w:r>
           </w:p>
         </w:tc>
@@ -3576,7 +3996,7 @@
           </w:tcPr>
           <w:p>
             <w:r>
-              <w:t>M6</w:t>
+              <w:t>M2</w:t>
             </w:r>
           </w:p>
         </w:tc>
@@ -3586,7 +4006,7 @@
           </w:tcPr>
           <w:p>
             <w:r>
-              <w:t>正常例でABG 20 dB</w:t>
+              <w:t>伝音難聴で必要ABGを消失</w:t>
             </w:r>
           </w:p>
         </w:tc>
@@ -3608,7 +4028,7 @@
           </w:tcPr>
           <w:p>
             <w:r>
-              <w:t>M7</w:t>
+              <w:t>M3</w:t>
             </w:r>
           </w:p>
         </w:tc>
@@ -3618,7 +4038,7 @@
           </w:tcPr>
           <w:p>
             <w:r>
-              <w:t>感音難聴でBCがACより大きく上昇</w:t>
+              <w:t>5 dB刻みを外した43 dB</w:t>
             </w:r>
           </w:p>
         </w:tc>
@@ -3640,7 +4060,7 @@
           </w:tcPr>
           <w:p>
             <w:r>
-              <w:t>M2</w:t>
+              <w:t>M4</w:t>
             </w:r>
           </w:p>
         </w:tc>
@@ -3650,7 +4070,7 @@
           </w:tcPr>
           <w:p>
             <w:r>
-              <w:t>伝音難聴で必要ABGを消失</w:t>
+              <w:t>突発性難聴で左右差&lt;30 dB</w:t>
             </w:r>
           </w:p>
         </w:tc>
@@ -3672,7 +4092,7 @@
           </w:tcPr>
           <w:p>
             <w:r>
-              <w:t>M1</w:t>
+              <w:t>M5</w:t>
             </w:r>
           </w:p>
         </w:tc>
@@ -3682,7 +4102,7 @@
           </w:tcPr>
           <w:p>
             <w:r>
-              <w:t>騒音性難聴でC5-dip消失</w:t>
+              <w:t>Carhart様変化の2 kHz BC上昇を消失</w:t>
             </w:r>
           </w:p>
         </w:tc>
@@ -3704,7 +4124,7 @@
           </w:tcPr>
           <w:p>
             <w:r>
-              <w:t>M4</w:t>
+              <w:t>M6</w:t>
             </w:r>
           </w:p>
         </w:tc>
@@ -3714,7 +4134,7 @@
           </w:tcPr>
           <w:p>
             <w:r>
-              <w:t>突発性難聴で左右差&lt;30 dB</w:t>
+              <w:t>正常例でABG 20 dB</w:t>
             </w:r>
           </w:p>
         </w:tc>
@@ -3736,7 +4156,7 @@
           </w:tcPr>
           <w:p>
             <w:r>
-              <w:t>M12</w:t>
+              <w:t>M7</w:t>
             </w:r>
           </w:p>
         </w:tc>
@@ -3746,7 +4166,7 @@
           </w:tcPr>
           <w:p>
             <w:r>
-              <w:t>程度を上げたのに閾値が低下</w:t>
+              <w:t>感音難聴でBCがACより大きく上昇</w:t>
             </w:r>
           </w:p>
         </w:tc>
@@ -3768,7 +4188,7 @@
           </w:tcPr>
           <w:p>
             <w:r>
-              <w:t>M5</w:t>
+              <w:t>M8</w:t>
             </w:r>
           </w:p>
         </w:tc>
@@ -3778,7 +4198,7 @@
           </w:tcPr>
           <w:p>
             <w:r>
-              <w:t>Carhart様変化の2 kHz BC上昇を消失</w:t>
+              <w:t>メタ疾患名と閾値の不一致</w:t>
             </w:r>
           </w:p>
         </w:tc>
@@ -3800,7 +4220,7 @@
           </w:tcPr>
           <w:p>
             <w:r>
-              <w:t>M13</w:t>
+              <w:t>M10</w:t>
             </w:r>
           </w:p>
         </w:tc>
@@ -3810,7 +4230,7 @@
           </w:tcPr>
           <w:p>
             <w:r>
-              <w:t>規定外のスケールアウト（NormalにSO）</w:t>
+              <w:t>C1周波数がSOのみ</w:t>
             </w:r>
           </w:p>
         </w:tc>
@@ -3832,7 +4252,7 @@
           </w:tcPr>
           <w:p>
             <w:r>
-              <w:t>M8</w:t>
+              <w:t>M12</w:t>
             </w:r>
           </w:p>
         </w:tc>
@@ -3842,7 +4262,7 @@
           </w:tcPr>
           <w:p>
             <w:r>
-              <w:t>メタ疾患名と閾値の不一致</w:t>
+              <w:t>程度を上げたのに閾値が低下</w:t>
             </w:r>
           </w:p>
         </w:tc>
@@ -3864,7 +4284,7 @@
           </w:tcPr>
           <w:p>
             <w:r>
-              <w:t>M10</w:t>
+              <w:t>M13</w:t>
             </w:r>
           </w:p>
         </w:tc>
@@ -3874,7 +4294,7 @@
           </w:tcPr>
           <w:p>
             <w:r>
-              <w:t>C1周波数がSOのみ</w:t>
+              <w:t>規定外のスケールアウト（NormalにSO）</w:t>
             </w:r>
           </w:p>
         </w:tc>
@@ -4113,12 +4533,39 @@
           </w:p>
         </w:tc>
       </w:tr>
+      <w:tr>
+        <w:tc>
+          <w:tcPr>
+            <w:tcW w:type="dxa" w:w="2880"/>
+          </w:tcPr>
+          <w:p>
+            <w:r>
+              <w:t>（欠番）</w:t>
+            </w:r>
+          </w:p>
+        </w:tc>
+        <w:tc>
+          <w:tcPr>
+            <w:tcW w:type="dxa" w:w="2880"/>
+          </w:tcPr>
+          <w:p>
+            <w:r>
+              <w:t>M9・M11は未使用</w:t>
+            </w:r>
+          </w:p>
+        </w:tc>
+        <w:tc>
+          <w:tcPr>
+            <w:tcW w:type="dxa" w:w="2880"/>
+          </w:tcPr>
+          <w:p>
+            <w:r>
+              <w:t>—</w:t>
+            </w:r>
+          </w:p>
+        </w:tc>
+      </w:tr>
     </w:tbl>
-    <w:p>
-      <w:r>
-        <w:t>NaNや必要周波数の欠損など、生成器が通常出力しない無効値は本稿の異常系対象外とした。</w:t>
-      </w:r>
-    </w:p>
     <w:p>
       <w:pPr>
         <w:pStyle w:val="Heading2"/>
@@ -4129,22 +4576,17 @@
     </w:p>
     <w:p>
       <w:r>
-        <w:t>・T7（突発一側差の焦点検証）は程度を中等度（程度2）に固定した条件であり、程度別の記述統計とは対象が異なる。規則床は程度≥1と同じ≥30 dBである。</w:t>
+        <w:t>・T7は程度2固定の焦点検証であり、程度別記述統計とは対象が異なる。規則床は程度≥1と同じ≥30 dB。</w:t>
       </w:r>
     </w:p>
     <w:p>
       <w:r>
-        <w:t>・ASA/ANSI S3.6およびISO 8253-1は、オージオメータ仕様および純音聴力検査手順の参照であり、生成器そのものの規格認証を意味しない。</w:t>
+        <w:t>・ASA/ANSI S3.6およびISO 8253-1は参照であり、生成器の規格認証を意味しない。</w:t>
       </w:r>
     </w:p>
     <w:p>
       <w:r>
         <w:t>・本付録は出力規則への適合確認の詳細であり、生成像の臨床的妥当性や教育効果を示すものではない。</w:t>
-      </w:r>
-    </w:p>
-    <w:p>
-      <w:r>
-        <w:t>・伝音ABGはパターン別に集計した（滲出性／急性・伝音型／急性・混合型／耳硬化／耳小骨離断）。詳細は表3を参照。</w:t>
       </w:r>
     </w:p>
     <w:sectPr>

</xml_diff>

<commit_message>
Rename 全周SO to 全周波数SO for clarity.
Replace ambiguous 全周 wording with 全周波数 in the v2.32 manuscript pack, supplement, verification notes, and generator/verifier comments.

Co-authored-by: Cursor <cursoragent@cursor.com>
</commit_message>
<xml_diff>
--- a/docs/pilot-study/manuscripts/Supplement1_verification.docx
+++ b/docs/pilot-study/manuscripts/Supplement1_verification.docx
@@ -3856,17 +3856,17 @@
     </w:p>
     <w:p>
       <w:r>
-        <w:t>・Sudden SO（程度≥1）：なし555件、高音域のみ139件、全周26件。</w:t>
+        <w:t>・Sudden SO（程度≥1）：なし555件、高音域のみ139件、全周波数26件。</w:t>
       </w:r>
     </w:p>
     <w:p>
       <w:r>
-        <w:t>・Mumps 全周SO（程度≥1）：354/720（49.2%）</w:t>
+        <w:t>・Mumps 全周波数SO（程度≥1）：354/720（49.2%）</w:t>
       </w:r>
     </w:p>
     <w:p>
       <w:r>
-        <w:t>・床規則の別掲（全周SOを除く）：突発一側差 694/694、突発程度3 214/214、ムンプス 366/366。「0.5/1/2 kHzにSOなし」再集計も同数となるが、全周SO以外では当該3周波にSOが生じない構造上一致するためである。</w:t>
+        <w:t>・床規則の別掲（全周波数SOを除く）：突発一側差 694/694、突発程度3 214/214、ムンプス 366/366。「0.5/1/2 kHzにSOなし」再集計も同数となるが、全周波数SO以外では当該3周波にSOが生じない構造上一致するためである。</w:t>
       </w:r>
     </w:p>
     <w:p>

</xml_diff>